<commit_message>
agregue contenido del enunciado
</commit_message>
<xml_diff>
--- a/Trabajo_ASI.docx
+++ b/Trabajo_ASI.docx
@@ -312,19 +312,11 @@
           <w:color w:val="000000"/>
         </w:rPr>
       </w:pPr>
-      <w:proofErr w:type="spellStart"/>
-      <w:r>
-        <w:rPr>
-          <w:color w:val="000000"/>
-        </w:rPr>
-        <w:t>Gomez</w:t>
-      </w:r>
-      <w:proofErr w:type="spellEnd"/>
-      <w:r>
-        <w:rPr>
-          <w:color w:val="000000"/>
-        </w:rPr>
-        <w:t xml:space="preserve">, Agustin                                                     </w:t>
+      <w:r>
+        <w:rPr>
+          <w:color w:val="000000"/>
+        </w:rPr>
+        <w:t xml:space="preserve">Gomez, Agustin                                                     </w:t>
       </w:r>
       <w:hyperlink r:id="rId9">
         <w:r>
@@ -342,19 +334,11 @@
           <w:color w:val="000000"/>
         </w:rPr>
       </w:pPr>
-      <w:proofErr w:type="spellStart"/>
-      <w:r>
-        <w:rPr>
-          <w:color w:val="000000"/>
-        </w:rPr>
-        <w:t>Gomez</w:t>
-      </w:r>
-      <w:proofErr w:type="spellEnd"/>
-      <w:r>
-        <w:rPr>
-          <w:color w:val="000000"/>
-        </w:rPr>
-        <w:t xml:space="preserve">, Gaspar                                                      </w:t>
+      <w:r>
+        <w:rPr>
+          <w:color w:val="000000"/>
+        </w:rPr>
+        <w:t xml:space="preserve">Gomez, Gaspar                                                      </w:t>
       </w:r>
       <w:hyperlink r:id="rId10">
         <w:r>
@@ -807,6 +791,32 @@
         <w:t>Una usuaria desea participar en un retiro holístico junto a tres amigas. Actualmente la información de los distintos retiros se encuentra dispersa en páginas web, redes sociales y contactos personales, lo que dificulta la comparación y organización de las opciones disponibles.</w:t>
       </w:r>
     </w:p>
+    <w:p>
+      <w:r>
+        <w:t>La usuaria necesita una aplicación que le permita consultar retiros holísticos, visualizar información relevante como fechas, duración, actividades incluidas, costos, imágenes y datos de contacto. Además, desea comparar distintas alternativas para elegir la más conveniente según sus intereses y disponibilidad.</w:t>
+      </w:r>
+    </w:p>
+    <w:p>
+      <w:r>
+        <w:t>Al ingresar al sistema, la usuaria puede buscar retiros utilizando filtros por fecha, duración, ubicación o actividades. El sistema muestra los resultados disponibles junto con información detallada de cada retiro.</w:t>
+      </w:r>
+    </w:p>
+    <w:p>
+      <w:r>
+        <w:t>Una vez identificadas las opciones de interés, la usuaria puede compararlas para analizar diferencias en costos, actividades y fechas. Posteriormente selecciona un retiro y registra su participación.</w:t>
+      </w:r>
+    </w:p>
+    <w:p>
+      <w:r>
+        <w:t>Durante el proceso de inscripción puede agregar acompañantes, hasta un máximo de cuatro participantes incluyendo a ella misma. También puede registrar información adicional relacionada con el retiro, como pagos realizados o pendientes.</w:t>
+      </w:r>
+    </w:p>
+    <w:p>
+      <w:r>
+        <w:t>Luego de la inscripción, el sistema envía recordatorios sobre fechas de pago y otra información importante asociada al retiro seleccionado.</w:t>
+      </w:r>
+    </w:p>
+    <w:p/>
     <w:p>
       <w:pPr>
         <w:rPr>

</xml_diff>

<commit_message>
Agrego los primeros 5 requerimientos
</commit_message>
<xml_diff>
--- a/Trabajo_ASI.docx
+++ b/Trabajo_ASI.docx
@@ -8,7 +8,7 @@
           <w:noProof/>
         </w:rPr>
         <w:drawing>
-          <wp:inline distT="0" distB="0" distL="0" distR="0" wp14:anchorId="6B0F2299" wp14:editId="3EAF253E">
+          <wp:inline distT="0" distB="0" distL="0" distR="0" wp14:anchorId="78F2AFBF" wp14:editId="114D1EBC">
             <wp:extent cx="5400040" cy="1077595"/>
             <wp:effectExtent l="0" t="0" r="0" b="0"/>
             <wp:docPr id="1" name="image1.png"/>
@@ -182,41 +182,21 @@
       </w:r>
     </w:p>
     <w:p>
-      <w:pPr>
-        <w:rPr>
-          <w:lang w:val="en-US"/>
-        </w:rPr>
-      </w:pPr>
       <w:proofErr w:type="spellStart"/>
       <w:r>
-        <w:rPr>
-          <w:lang w:val="en-US"/>
-        </w:rPr>
         <w:t>Bonoris</w:t>
       </w:r>
       <w:proofErr w:type="spellEnd"/>
       <w:r>
-        <w:rPr>
-          <w:lang w:val="en-US"/>
-        </w:rPr>
         <w:t>, Valentin Fernando</w:t>
       </w:r>
       <w:r>
-        <w:rPr>
-          <w:lang w:val="en-US"/>
-        </w:rPr>
         <w:tab/>
       </w:r>
       <w:r>
-        <w:rPr>
-          <w:lang w:val="en-US"/>
-        </w:rPr>
         <w:tab/>
       </w:r>
       <w:r>
-        <w:rPr>
-          <w:lang w:val="en-US"/>
-        </w:rPr>
         <w:tab/>
       </w:r>
       <w:hyperlink r:id="rId5">
@@ -224,7 +204,6 @@
           <w:rPr>
             <w:color w:val="467886"/>
             <w:u w:val="single"/>
-            <w:lang w:val="en-US"/>
           </w:rPr>
           <w:t>valeferbonoris03@gmail.com</w:t>
         </w:r>
@@ -657,52 +636,29 @@
     <w:p>
       <w:pPr>
         <w:rPr>
-          <w:rFonts w:ascii="Calibri" w:hAnsi="Calibri" w:eastAsia="Calibri" w:cs="Calibri"/>
+          <w:color w:val="000000" w:themeColor="text1"/>
+        </w:rPr>
+      </w:pPr>
+      <w:r>
+        <w:rPr>
           <w:b/>
           <w:bCs/>
+          <w:color w:val="000000" w:themeColor="text1"/>
+        </w:rPr>
+        <w:t>Logotipo:</w:t>
+      </w:r>
+      <w:r>
+        <w:br/>
+      </w:r>
+      <w:r>
+        <w:rPr>
           <w:noProof/>
-          <w:color w:val="000000"/>
-        </w:rPr>
-      </w:pPr>
-      <w:r>
-        <w:rPr>
-          <w:rFonts w:ascii="Calibri" w:hAnsi="Calibri" w:eastAsia="Calibri" w:cs="Calibri"/>
-          <w:b/>
-          <w:bCs/>
-          <w:color w:val="000000"/>
-        </w:rPr>
-        <w:t>Logotipo:</w:t>
-      </w:r>
-      <w:r>
-        <w:rPr>
-          <w:rFonts w:ascii="Calibri" w:hAnsi="Calibri" w:eastAsia="Calibri" w:cs="Calibri"/>
-          <w:b/>
-          <w:bCs/>
-          <w:color w:val="000000"/>
-        </w:rPr>
-        <w:br/>
-      </w:r>
-    </w:p>
-    <w:p>
-      <w:pPr>
-        <w:rPr>
-          <w:b/>
-          <w:bCs/>
-        </w:rPr>
-      </w:pPr>
-      <w:r>
-        <w:rPr>
-          <w:rFonts w:ascii="Calibri" w:hAnsi="Calibri" w:eastAsia="Calibri" w:cs="Calibri"/>
-          <w:b/>
-          <w:bCs/>
-          <w:noProof/>
-          <w:color w:val="000000"/>
         </w:rPr>
         <w:drawing>
-          <wp:inline distT="0" distB="0" distL="0" distR="0" wp14:anchorId="118DE1BA" wp14:editId="17D50EF4">
-            <wp:extent cx="5897880" cy="3219643"/>
-            <wp:effectExtent l="0" t="0" r="7620" b="0"/>
-            <wp:docPr id="951131601" name="Imagen 2"/>
+          <wp:inline distT="0" distB="0" distL="0" distR="0" wp14:anchorId="0B155F9B" wp14:editId="4E017CEC">
+            <wp:extent cx="4572000" cy="2495550"/>
+            <wp:effectExtent l="0" t="0" r="0" b="0"/>
+            <wp:docPr id="1305419259" name="drawing"/>
             <wp:cNvGraphicFramePr>
               <a:graphicFrameLocks xmlns:a="http://schemas.openxmlformats.org/drawingml/2006/main" noChangeAspect="1"/>
             </wp:cNvGraphicFramePr>
@@ -710,33 +666,29 @@
               <a:graphicData uri="http://schemas.openxmlformats.org/drawingml/2006/picture">
                 <pic:pic xmlns:pic="http://schemas.openxmlformats.org/drawingml/2006/picture">
                   <pic:nvPicPr>
-                    <pic:cNvPr id="0" name="Picture 2"/>
-                    <pic:cNvPicPr>
-                      <a:picLocks noChangeAspect="1" noChangeArrowheads="1"/>
-                    </pic:cNvPicPr>
+                    <pic:cNvPr id="1305419259" name="Picture 1305419259"/>
+                    <pic:cNvPicPr/>
                   </pic:nvPicPr>
                   <pic:blipFill>
                     <a:blip r:embed="rId12">
                       <a:extLst>
                         <a:ext uri="{28A0092B-C50C-407E-A947-70E740481C1C}">
-                          <a14:useLocalDpi xmlns:a14="http://schemas.microsoft.com/office/drawing/2010/main" val="0"/>
+                          <a14:useLocalDpi xmlns:a14="http://schemas.microsoft.com/office/drawing/2010/main"/>
                         </a:ext>
                       </a:extLst>
                     </a:blip>
-                    <a:srcRect/>
                     <a:stretch>
                       <a:fillRect/>
                     </a:stretch>
                   </pic:blipFill>
-                  <pic:spPr bwMode="auto">
+                  <pic:spPr>
                     <a:xfrm>
                       <a:off x="0" y="0"/>
-                      <a:ext cx="5913996" cy="3228441"/>
+                      <a:ext cx="4572000" cy="2495550"/>
                     </a:xfrm>
                     <a:prstGeom prst="rect">
                       <a:avLst/>
                     </a:prstGeom>
-                    <a:noFill/>
                   </pic:spPr>
                 </pic:pic>
               </a:graphicData>
@@ -745,70 +697,7 @@
         </w:drawing>
       </w:r>
     </w:p>
-    <w:p>
-      <w:pPr>
-        <w:rPr>
-          <w:b/>
-          <w:bCs/>
-        </w:rPr>
-      </w:pPr>
-    </w:p>
-    <w:p>
-      <w:pPr>
-        <w:rPr>
-          <w:b/>
-          <w:bCs/>
-        </w:rPr>
-      </w:pPr>
-    </w:p>
-    <w:p>
-      <w:pPr>
-        <w:rPr>
-          <w:b/>
-          <w:bCs/>
-        </w:rPr>
-      </w:pPr>
-    </w:p>
-    <w:p>
-      <w:pPr>
-        <w:rPr>
-          <w:b/>
-          <w:bCs/>
-        </w:rPr>
-      </w:pPr>
-    </w:p>
-    <w:p>
-      <w:pPr>
-        <w:rPr>
-          <w:b/>
-          <w:bCs/>
-        </w:rPr>
-      </w:pPr>
-    </w:p>
-    <w:p>
-      <w:pPr>
-        <w:rPr>
-          <w:b/>
-          <w:bCs/>
-        </w:rPr>
-      </w:pPr>
-    </w:p>
-    <w:p>
-      <w:pPr>
-        <w:rPr>
-          <w:b/>
-          <w:bCs/>
-        </w:rPr>
-      </w:pPr>
-    </w:p>
-    <w:p>
-      <w:pPr>
-        <w:rPr>
-          <w:b/>
-          <w:bCs/>
-        </w:rPr>
-      </w:pPr>
-    </w:p>
+    <w:p/>
     <w:p>
       <w:pPr>
         <w:pStyle w:val="Ttulo1"/>
@@ -821,8 +710,74 @@
     </w:p>
     <w:p>
       <w:r>
+        <w:t>Una usuaria desea participar en un retiro holístico junto a tres amigas. Actualmente la información de los distintos retiros se encuentra dispersa en páginas web, redes sociales y contactos personales, lo que dificulta la comparación y organización de las opciones disponibles.</w:t>
+      </w:r>
+    </w:p>
+    <w:p>
+      <w:r>
+        <w:t>La usuaria necesita una aplicación que le permita consultar retiros holísticos, visualizar información relevante como fechas, duración, actividades incluidas, costos, imágenes y datos de contacto. Además, desea comparar distintas alternativas para elegir la más conveniente según sus intereses y disponibilidad.</w:t>
+      </w:r>
+    </w:p>
+    <w:p>
+      <w:r>
+        <w:t>Al ingresar al sistema, la usuaria puede buscar retiros utilizando filtros por fecha, duración, ubicación o actividades. El sistema muestra los resultados disponibles junto con información detallada de cada retiro.</w:t>
+      </w:r>
+    </w:p>
+    <w:p>
+      <w:r>
+        <w:t>Una vez identificadas las opciones de interés, la usuaria puede compararlas para analizar diferencias en costos, actividades y fechas. Posteriormente selecciona un retiro y registra su participación.</w:t>
+      </w:r>
+    </w:p>
+    <w:p>
+      <w:r>
+        <w:t>Durante el proceso de inscripción puede agregar acompañantes, hasta un máximo de cuatro participantes incluyendo a ella misma. También puede registrar información adicional relacionada con el retiro, como pagos realizados o pendientes.</w:t>
+      </w:r>
+    </w:p>
+    <w:p>
+      <w:r>
+        <w:t>Luego de la inscripción, el sistema envía recordatorios sobre fechas de pago y otra información importante asociada al retiro seleccionado.</w:t>
+      </w:r>
+    </w:p>
+    <w:p>
+      <w:r>
         <w:rPr/>
-        <w:t>Una usuaria desea participar en un retiro holístico junto a tres amigas. Actualmente la información de los distintos retiros se encuentra dispersa en páginas web, redes sociales y contactos personales, lo que dificulta la comparación y organización de las opciones disponibles.</w:t>
+        <w:t>Finalmente, cuando se realiza el retiro y concluyen todas las actividades programadas, la usuaria conserva el historial y la información del evento para futuras consultas.</w:t>
+      </w:r>
+    </w:p>
+    <w:p>
+      <w:pPr>
+        <w:pStyle w:val="Ttulo1"/>
+        <w:rPr>
+          <w:rFonts w:ascii="Aptos" w:hAnsi="Aptos" w:eastAsia="Aptos" w:cs="Aptos"/>
+          <w:b w:val="1"/>
+          <w:bCs w:val="1"/>
+          <w:i w:val="0"/>
+          <w:iCs w:val="0"/>
+          <w:caps w:val="0"/>
+          <w:smallCaps w:val="0"/>
+          <w:noProof w:val="0"/>
+          <w:color w:val="000000" w:themeColor="text1" w:themeTint="FF" w:themeShade="FF"/>
+          <w:sz w:val="24"/>
+          <w:szCs w:val="24"/>
+          <w:lang w:val="es-AR"/>
+        </w:rPr>
+      </w:pPr>
+      <w:r>
+        <w:rPr>
+          <w:rFonts w:ascii="Aptos" w:hAnsi="Aptos" w:eastAsia="Aptos" w:cs="Aptos"/>
+          <w:b w:val="1"/>
+          <w:bCs w:val="1"/>
+          <w:i w:val="0"/>
+          <w:iCs w:val="0"/>
+          <w:caps w:val="0"/>
+          <w:smallCaps w:val="0"/>
+          <w:noProof w:val="0"/>
+          <w:color w:val="000000" w:themeColor="text1" w:themeTint="FF" w:themeShade="FF"/>
+          <w:sz w:val="24"/>
+          <w:szCs w:val="24"/>
+          <w:lang w:val="es-AR"/>
+        </w:rPr>
+        <w:t>Requerimientos funcionales</w:t>
       </w:r>
     </w:p>
     <w:p>
@@ -845,6 +800,23 @@
       <w:r>
         <w:rPr>
           <w:rFonts w:ascii="Aptos" w:hAnsi="Aptos" w:eastAsia="Aptos" w:cs="Aptos"/>
+          <w:b w:val="1"/>
+          <w:bCs w:val="1"/>
+          <w:i w:val="0"/>
+          <w:iCs w:val="0"/>
+          <w:caps w:val="0"/>
+          <w:smallCaps w:val="0"/>
+          <w:noProof w:val="0"/>
+          <w:color w:val="000000" w:themeColor="text1" w:themeTint="FF" w:themeShade="FF"/>
+          <w:sz w:val="24"/>
+          <w:szCs w:val="24"/>
+          <w:lang w:val="es-AR"/>
+        </w:rPr>
+        <w:t>RF01.</w:t>
+      </w:r>
+      <w:r>
+        <w:rPr>
+          <w:rFonts w:ascii="Aptos" w:hAnsi="Aptos" w:eastAsia="Aptos" w:cs="Aptos"/>
           <w:b w:val="0"/>
           <w:bCs w:val="0"/>
           <w:i w:val="0"/>
@@ -857,14 +829,11 @@
           <w:szCs w:val="24"/>
           <w:lang w:val="es-AR"/>
         </w:rPr>
-        <w:t>La usuaria necesita una aplicación que le permita consultar retiros holísticos, visualizar información relevante como fechas, duración, actividades incluidas, costos, imágenes y datos de contacto. Además, desea comparar distintas alternativas para elegir la más conveniente según sus intereses y disponibilidad.</w:t>
-      </w:r>
-    </w:p>
-    <w:p>
-      <w:pPr>
-        <w:pStyle w:val="Normal"/>
-      </w:pPr>
-      <w:r>
+        <w:t xml:space="preserve"> El sistema deberá permitir visualizar la lista de retiros disponibles.</w:t>
+      </w:r>
+    </w:p>
+    <w:p>
+      <w:pPr>
         <w:rPr>
           <w:rFonts w:ascii="Aptos" w:hAnsi="Aptos" w:eastAsia="Aptos" w:cs="Aptos"/>
           <w:b w:val="0"/>
@@ -879,20 +848,24 @@
           <w:szCs w:val="24"/>
           <w:lang w:val="es-AR"/>
         </w:rPr>
-        <w:t>Al ingresar al sistema, la usuaria puede buscar retiros utilizando filtros por fecha, duración, ubicación o actividades. El sistema muestra los resultados disponibles junto con información detallada de cada retiro.</w:t>
-      </w:r>
-    </w:p>
-    <w:p>
-      <w:pPr>
-        <w:pStyle w:val="Normal"/>
-        <w:rPr>
-          <w:rFonts w:ascii="Aptos" w:hAnsi="Aptos" w:eastAsia="Aptos" w:cs="Aptos"/>
-          <w:noProof w:val="0"/>
-          <w:sz w:val="24"/>
-          <w:szCs w:val="24"/>
-          <w:lang w:val="es-AR"/>
-        </w:rPr>
-      </w:pPr>
+      </w:pPr>
+      <w:r>
+        <w:rPr>
+          <w:rFonts w:ascii="Aptos" w:hAnsi="Aptos" w:eastAsia="Aptos" w:cs="Aptos"/>
+          <w:b w:val="1"/>
+          <w:bCs w:val="1"/>
+          <w:i w:val="0"/>
+          <w:iCs w:val="0"/>
+          <w:caps w:val="0"/>
+          <w:smallCaps w:val="0"/>
+          <w:noProof w:val="0"/>
+          <w:color w:val="000000" w:themeColor="text1" w:themeTint="FF" w:themeShade="FF"/>
+          <w:sz w:val="24"/>
+          <w:szCs w:val="24"/>
+          <w:lang w:val="es-AR"/>
+        </w:rPr>
+        <w:t>RF02.</w:t>
+      </w:r>
       <w:r>
         <w:rPr>
           <w:rFonts w:ascii="Aptos" w:hAnsi="Aptos" w:eastAsia="Aptos" w:cs="Aptos"/>
@@ -902,66 +875,452 @@
           <w:iCs w:val="0"/>
           <w:caps w:val="0"/>
           <w:smallCaps w:val="0"/>
-          <w:strike w:val="0"/>
-          <w:dstrike w:val="0"/>
-          <w:noProof w:val="0"/>
-          <w:color w:val="000000" w:themeColor="text1" w:themeTint="FF" w:themeShade="FF"/>
-          <w:sz w:val="24"/>
-          <w:szCs w:val="24"/>
-          <w:u w:val="none"/>
-          <w:lang w:val="es-AR"/>
-        </w:rPr>
-        <w:t>Una vez identificadas las opciones de interés, la usuaria puede compararlas para analizar diferencias en costos, actividades y fechas. Posteriormente selecciona un retiro y registra su participación.</w:t>
-      </w:r>
-    </w:p>
-    <w:p>
-      <w:pPr>
-        <w:rPr>
-          <w:b/>
-          <w:bCs/>
-        </w:rPr>
-      </w:pPr>
-    </w:p>
-    <w:p>
-      <w:pPr>
-        <w:rPr>
-          <w:b/>
-          <w:bCs/>
-        </w:rPr>
-      </w:pPr>
-    </w:p>
-    <w:p>
-      <w:pPr>
-        <w:rPr>
-          <w:b/>
-          <w:bCs/>
-        </w:rPr>
-      </w:pPr>
-    </w:p>
-    <w:p>
-      <w:pPr>
-        <w:rPr>
-          <w:b/>
-          <w:bCs/>
-        </w:rPr>
-      </w:pPr>
-    </w:p>
-    <w:p>
-      <w:pPr>
-        <w:rPr>
-          <w:b/>
-          <w:bCs/>
-        </w:rPr>
-      </w:pPr>
-    </w:p>
-    <w:p>
-      <w:pPr>
-        <w:rPr>
-          <w:b/>
-          <w:bCs/>
-        </w:rPr>
-      </w:pPr>
-    </w:p>
+          <w:noProof w:val="0"/>
+          <w:color w:val="000000" w:themeColor="text1" w:themeTint="FF" w:themeShade="FF"/>
+          <w:sz w:val="24"/>
+          <w:szCs w:val="24"/>
+          <w:lang w:val="es-AR"/>
+        </w:rPr>
+        <w:t xml:space="preserve"> El sistema deberá permitir registrar nuevos retiros.</w:t>
+      </w:r>
+    </w:p>
+    <w:p>
+      <w:pPr>
+        <w:rPr>
+          <w:rFonts w:ascii="Aptos" w:hAnsi="Aptos" w:eastAsia="Aptos" w:cs="Aptos"/>
+          <w:b w:val="0"/>
+          <w:bCs w:val="0"/>
+          <w:i w:val="0"/>
+          <w:iCs w:val="0"/>
+          <w:caps w:val="0"/>
+          <w:smallCaps w:val="0"/>
+          <w:noProof w:val="0"/>
+          <w:color w:val="000000" w:themeColor="text1" w:themeTint="FF" w:themeShade="FF"/>
+          <w:sz w:val="24"/>
+          <w:szCs w:val="24"/>
+          <w:lang w:val="es-AR"/>
+        </w:rPr>
+      </w:pPr>
+      <w:r>
+        <w:rPr>
+          <w:rFonts w:ascii="Aptos" w:hAnsi="Aptos" w:eastAsia="Aptos" w:cs="Aptos"/>
+          <w:b w:val="1"/>
+          <w:bCs w:val="1"/>
+          <w:i w:val="0"/>
+          <w:iCs w:val="0"/>
+          <w:caps w:val="0"/>
+          <w:smallCaps w:val="0"/>
+          <w:noProof w:val="0"/>
+          <w:color w:val="000000" w:themeColor="text1" w:themeTint="FF" w:themeShade="FF"/>
+          <w:sz w:val="24"/>
+          <w:szCs w:val="24"/>
+          <w:lang w:val="es-AR"/>
+        </w:rPr>
+        <w:t>RF03.</w:t>
+      </w:r>
+      <w:r>
+        <w:rPr>
+          <w:rFonts w:ascii="Aptos" w:hAnsi="Aptos" w:eastAsia="Aptos" w:cs="Aptos"/>
+          <w:b w:val="0"/>
+          <w:bCs w:val="0"/>
+          <w:i w:val="0"/>
+          <w:iCs w:val="0"/>
+          <w:caps w:val="0"/>
+          <w:smallCaps w:val="0"/>
+          <w:noProof w:val="0"/>
+          <w:color w:val="000000" w:themeColor="text1" w:themeTint="FF" w:themeShade="FF"/>
+          <w:sz w:val="24"/>
+          <w:szCs w:val="24"/>
+          <w:lang w:val="es-AR"/>
+        </w:rPr>
+        <w:t xml:space="preserve"> El sistema deberá mostrar la información detallada de cada retiro, incluyendo:</w:t>
+      </w:r>
+    </w:p>
+    <w:p>
+      <w:pPr>
+        <w:pStyle w:val="ListParagraph"/>
+        <w:numPr>
+          <w:ilvl w:val="0"/>
+          <w:numId w:val="1"/>
+        </w:numPr>
+        <w:rPr>
+          <w:rFonts w:ascii="Aptos" w:hAnsi="Aptos" w:eastAsia="Aptos" w:cs="Aptos"/>
+          <w:b w:val="0"/>
+          <w:bCs w:val="0"/>
+          <w:i w:val="0"/>
+          <w:iCs w:val="0"/>
+          <w:caps w:val="0"/>
+          <w:smallCaps w:val="0"/>
+          <w:noProof w:val="0"/>
+          <w:color w:val="000000" w:themeColor="text1" w:themeTint="FF" w:themeShade="FF"/>
+          <w:sz w:val="24"/>
+          <w:szCs w:val="24"/>
+          <w:lang w:val="es-AR"/>
+        </w:rPr>
+      </w:pPr>
+      <w:r>
+        <w:rPr>
+          <w:rFonts w:ascii="Aptos" w:hAnsi="Aptos" w:eastAsia="Aptos" w:cs="Aptos"/>
+          <w:b w:val="0"/>
+          <w:bCs w:val="0"/>
+          <w:i w:val="0"/>
+          <w:iCs w:val="0"/>
+          <w:caps w:val="0"/>
+          <w:smallCaps w:val="0"/>
+          <w:noProof w:val="0"/>
+          <w:color w:val="000000" w:themeColor="text1" w:themeTint="FF" w:themeShade="FF"/>
+          <w:sz w:val="24"/>
+          <w:szCs w:val="24"/>
+          <w:lang w:val="es-AR"/>
+        </w:rPr>
+        <w:t xml:space="preserve">Nombre. </w:t>
+      </w:r>
+    </w:p>
+    <w:p>
+      <w:pPr>
+        <w:pStyle w:val="ListParagraph"/>
+        <w:numPr>
+          <w:ilvl w:val="0"/>
+          <w:numId w:val="1"/>
+        </w:numPr>
+        <w:rPr>
+          <w:rFonts w:ascii="Aptos" w:hAnsi="Aptos" w:eastAsia="Aptos" w:cs="Aptos"/>
+          <w:b w:val="0"/>
+          <w:bCs w:val="0"/>
+          <w:i w:val="0"/>
+          <w:iCs w:val="0"/>
+          <w:caps w:val="0"/>
+          <w:smallCaps w:val="0"/>
+          <w:noProof w:val="0"/>
+          <w:color w:val="000000" w:themeColor="text1" w:themeTint="FF" w:themeShade="FF"/>
+          <w:sz w:val="24"/>
+          <w:szCs w:val="24"/>
+          <w:lang w:val="es-AR"/>
+        </w:rPr>
+      </w:pPr>
+      <w:r>
+        <w:rPr>
+          <w:rFonts w:ascii="Aptos" w:hAnsi="Aptos" w:eastAsia="Aptos" w:cs="Aptos"/>
+          <w:b w:val="0"/>
+          <w:bCs w:val="0"/>
+          <w:i w:val="0"/>
+          <w:iCs w:val="0"/>
+          <w:caps w:val="0"/>
+          <w:smallCaps w:val="0"/>
+          <w:noProof w:val="0"/>
+          <w:color w:val="000000" w:themeColor="text1" w:themeTint="FF" w:themeShade="FF"/>
+          <w:sz w:val="24"/>
+          <w:szCs w:val="24"/>
+          <w:lang w:val="es-AR"/>
+        </w:rPr>
+        <w:t xml:space="preserve">Fecha. </w:t>
+      </w:r>
+    </w:p>
+    <w:p>
+      <w:pPr>
+        <w:pStyle w:val="ListParagraph"/>
+        <w:numPr>
+          <w:ilvl w:val="0"/>
+          <w:numId w:val="1"/>
+        </w:numPr>
+        <w:rPr>
+          <w:rFonts w:ascii="Aptos" w:hAnsi="Aptos" w:eastAsia="Aptos" w:cs="Aptos"/>
+          <w:b w:val="0"/>
+          <w:bCs w:val="0"/>
+          <w:i w:val="0"/>
+          <w:iCs w:val="0"/>
+          <w:caps w:val="0"/>
+          <w:smallCaps w:val="0"/>
+          <w:noProof w:val="0"/>
+          <w:color w:val="000000" w:themeColor="text1" w:themeTint="FF" w:themeShade="FF"/>
+          <w:sz w:val="24"/>
+          <w:szCs w:val="24"/>
+          <w:lang w:val="es-AR"/>
+        </w:rPr>
+      </w:pPr>
+      <w:r>
+        <w:rPr>
+          <w:rFonts w:ascii="Aptos" w:hAnsi="Aptos" w:eastAsia="Aptos" w:cs="Aptos"/>
+          <w:b w:val="0"/>
+          <w:bCs w:val="0"/>
+          <w:i w:val="0"/>
+          <w:iCs w:val="0"/>
+          <w:caps w:val="0"/>
+          <w:smallCaps w:val="0"/>
+          <w:noProof w:val="0"/>
+          <w:color w:val="000000" w:themeColor="text1" w:themeTint="FF" w:themeShade="FF"/>
+          <w:sz w:val="24"/>
+          <w:szCs w:val="24"/>
+          <w:lang w:val="es-AR"/>
+        </w:rPr>
+        <w:t xml:space="preserve">Duración. </w:t>
+      </w:r>
+    </w:p>
+    <w:p>
+      <w:pPr>
+        <w:pStyle w:val="ListParagraph"/>
+        <w:numPr>
+          <w:ilvl w:val="0"/>
+          <w:numId w:val="1"/>
+        </w:numPr>
+        <w:rPr>
+          <w:rFonts w:ascii="Aptos" w:hAnsi="Aptos" w:eastAsia="Aptos" w:cs="Aptos"/>
+          <w:b w:val="0"/>
+          <w:bCs w:val="0"/>
+          <w:i w:val="0"/>
+          <w:iCs w:val="0"/>
+          <w:caps w:val="0"/>
+          <w:smallCaps w:val="0"/>
+          <w:noProof w:val="0"/>
+          <w:color w:val="000000" w:themeColor="text1" w:themeTint="FF" w:themeShade="FF"/>
+          <w:sz w:val="24"/>
+          <w:szCs w:val="24"/>
+          <w:lang w:val="es-AR"/>
+        </w:rPr>
+      </w:pPr>
+      <w:r>
+        <w:rPr>
+          <w:rFonts w:ascii="Aptos" w:hAnsi="Aptos" w:eastAsia="Aptos" w:cs="Aptos"/>
+          <w:b w:val="0"/>
+          <w:bCs w:val="0"/>
+          <w:i w:val="0"/>
+          <w:iCs w:val="0"/>
+          <w:caps w:val="0"/>
+          <w:smallCaps w:val="0"/>
+          <w:noProof w:val="0"/>
+          <w:color w:val="000000" w:themeColor="text1" w:themeTint="FF" w:themeShade="FF"/>
+          <w:sz w:val="24"/>
+          <w:szCs w:val="24"/>
+          <w:lang w:val="es-AR"/>
+        </w:rPr>
+        <w:t xml:space="preserve">Actividades. </w:t>
+      </w:r>
+    </w:p>
+    <w:p>
+      <w:pPr>
+        <w:pStyle w:val="ListParagraph"/>
+        <w:numPr>
+          <w:ilvl w:val="0"/>
+          <w:numId w:val="1"/>
+        </w:numPr>
+        <w:rPr>
+          <w:rFonts w:ascii="Aptos" w:hAnsi="Aptos" w:eastAsia="Aptos" w:cs="Aptos"/>
+          <w:b w:val="0"/>
+          <w:bCs w:val="0"/>
+          <w:i w:val="0"/>
+          <w:iCs w:val="0"/>
+          <w:caps w:val="0"/>
+          <w:smallCaps w:val="0"/>
+          <w:noProof w:val="0"/>
+          <w:color w:val="000000" w:themeColor="text1" w:themeTint="FF" w:themeShade="FF"/>
+          <w:sz w:val="24"/>
+          <w:szCs w:val="24"/>
+          <w:lang w:val="es-AR"/>
+        </w:rPr>
+      </w:pPr>
+      <w:r>
+        <w:rPr>
+          <w:rFonts w:ascii="Aptos" w:hAnsi="Aptos" w:eastAsia="Aptos" w:cs="Aptos"/>
+          <w:b w:val="0"/>
+          <w:bCs w:val="0"/>
+          <w:i w:val="0"/>
+          <w:iCs w:val="0"/>
+          <w:caps w:val="0"/>
+          <w:smallCaps w:val="0"/>
+          <w:noProof w:val="0"/>
+          <w:color w:val="000000" w:themeColor="text1" w:themeTint="FF" w:themeShade="FF"/>
+          <w:sz w:val="24"/>
+          <w:szCs w:val="24"/>
+          <w:lang w:val="es-AR"/>
+        </w:rPr>
+        <w:t xml:space="preserve">Costos. </w:t>
+      </w:r>
+    </w:p>
+    <w:p>
+      <w:pPr>
+        <w:pStyle w:val="ListParagraph"/>
+        <w:numPr>
+          <w:ilvl w:val="0"/>
+          <w:numId w:val="1"/>
+        </w:numPr>
+        <w:rPr>
+          <w:rFonts w:ascii="Aptos" w:hAnsi="Aptos" w:eastAsia="Aptos" w:cs="Aptos"/>
+          <w:b w:val="0"/>
+          <w:bCs w:val="0"/>
+          <w:i w:val="0"/>
+          <w:iCs w:val="0"/>
+          <w:caps w:val="0"/>
+          <w:smallCaps w:val="0"/>
+          <w:noProof w:val="0"/>
+          <w:color w:val="000000" w:themeColor="text1" w:themeTint="FF" w:themeShade="FF"/>
+          <w:sz w:val="24"/>
+          <w:szCs w:val="24"/>
+          <w:lang w:val="es-AR"/>
+        </w:rPr>
+      </w:pPr>
+      <w:r>
+        <w:rPr>
+          <w:rFonts w:ascii="Aptos" w:hAnsi="Aptos" w:eastAsia="Aptos" w:cs="Aptos"/>
+          <w:b w:val="0"/>
+          <w:bCs w:val="0"/>
+          <w:i w:val="0"/>
+          <w:iCs w:val="0"/>
+          <w:caps w:val="0"/>
+          <w:smallCaps w:val="0"/>
+          <w:noProof w:val="0"/>
+          <w:color w:val="000000" w:themeColor="text1" w:themeTint="FF" w:themeShade="FF"/>
+          <w:sz w:val="24"/>
+          <w:szCs w:val="24"/>
+          <w:lang w:val="es-AR"/>
+        </w:rPr>
+        <w:t xml:space="preserve">Datos de contacto. </w:t>
+      </w:r>
+    </w:p>
+    <w:p>
+      <w:pPr>
+        <w:pStyle w:val="ListParagraph"/>
+        <w:numPr>
+          <w:ilvl w:val="0"/>
+          <w:numId w:val="1"/>
+        </w:numPr>
+        <w:rPr>
+          <w:rFonts w:ascii="Aptos" w:hAnsi="Aptos" w:eastAsia="Aptos" w:cs="Aptos"/>
+          <w:b w:val="0"/>
+          <w:bCs w:val="0"/>
+          <w:i w:val="0"/>
+          <w:iCs w:val="0"/>
+          <w:caps w:val="0"/>
+          <w:smallCaps w:val="0"/>
+          <w:noProof w:val="0"/>
+          <w:color w:val="000000" w:themeColor="text1" w:themeTint="FF" w:themeShade="FF"/>
+          <w:sz w:val="24"/>
+          <w:szCs w:val="24"/>
+          <w:lang w:val="es-AR"/>
+        </w:rPr>
+      </w:pPr>
+      <w:r>
+        <w:rPr>
+          <w:rFonts w:ascii="Aptos" w:hAnsi="Aptos" w:eastAsia="Aptos" w:cs="Aptos"/>
+          <w:b w:val="0"/>
+          <w:bCs w:val="0"/>
+          <w:i w:val="0"/>
+          <w:iCs w:val="0"/>
+          <w:caps w:val="0"/>
+          <w:smallCaps w:val="0"/>
+          <w:noProof w:val="0"/>
+          <w:color w:val="000000" w:themeColor="text1" w:themeTint="FF" w:themeShade="FF"/>
+          <w:sz w:val="24"/>
+          <w:szCs w:val="24"/>
+          <w:lang w:val="es-AR"/>
+        </w:rPr>
+        <w:t xml:space="preserve">Página web asociada. </w:t>
+      </w:r>
+    </w:p>
+    <w:p>
+      <w:pPr>
+        <w:rPr>
+          <w:rFonts w:ascii="Aptos" w:hAnsi="Aptos" w:eastAsia="Aptos" w:cs="Aptos"/>
+          <w:b w:val="0"/>
+          <w:bCs w:val="0"/>
+          <w:i w:val="0"/>
+          <w:iCs w:val="0"/>
+          <w:caps w:val="0"/>
+          <w:smallCaps w:val="0"/>
+          <w:noProof w:val="0"/>
+          <w:color w:val="000000" w:themeColor="text1" w:themeTint="FF" w:themeShade="FF"/>
+          <w:sz w:val="24"/>
+          <w:szCs w:val="24"/>
+          <w:lang w:val="es-AR"/>
+        </w:rPr>
+      </w:pPr>
+      <w:r>
+        <w:rPr>
+          <w:rFonts w:ascii="Aptos" w:hAnsi="Aptos" w:eastAsia="Aptos" w:cs="Aptos"/>
+          <w:b w:val="1"/>
+          <w:bCs w:val="1"/>
+          <w:i w:val="0"/>
+          <w:iCs w:val="0"/>
+          <w:caps w:val="0"/>
+          <w:smallCaps w:val="0"/>
+          <w:noProof w:val="0"/>
+          <w:color w:val="000000" w:themeColor="text1" w:themeTint="FF" w:themeShade="FF"/>
+          <w:sz w:val="24"/>
+          <w:szCs w:val="24"/>
+          <w:lang w:val="es-AR"/>
+        </w:rPr>
+        <w:t>RF04.</w:t>
+      </w:r>
+      <w:r>
+        <w:rPr>
+          <w:rFonts w:ascii="Aptos" w:hAnsi="Aptos" w:eastAsia="Aptos" w:cs="Aptos"/>
+          <w:b w:val="0"/>
+          <w:bCs w:val="0"/>
+          <w:i w:val="0"/>
+          <w:iCs w:val="0"/>
+          <w:caps w:val="0"/>
+          <w:smallCaps w:val="0"/>
+          <w:noProof w:val="0"/>
+          <w:color w:val="000000" w:themeColor="text1" w:themeTint="FF" w:themeShade="FF"/>
+          <w:sz w:val="24"/>
+          <w:szCs w:val="24"/>
+          <w:lang w:val="es-AR"/>
+        </w:rPr>
+        <w:t xml:space="preserve"> El sistema deberá mostrar imágenes asociadas a cada retiro.</w:t>
+      </w:r>
+    </w:p>
+    <w:p>
+      <w:pPr>
+        <w:rPr>
+          <w:rFonts w:ascii="Aptos" w:hAnsi="Aptos" w:eastAsia="Aptos" w:cs="Aptos"/>
+          <w:b w:val="0"/>
+          <w:bCs w:val="0"/>
+          <w:i w:val="0"/>
+          <w:iCs w:val="0"/>
+          <w:caps w:val="0"/>
+          <w:smallCaps w:val="0"/>
+          <w:noProof w:val="0"/>
+          <w:color w:val="000000" w:themeColor="text1" w:themeTint="FF" w:themeShade="FF"/>
+          <w:sz w:val="24"/>
+          <w:szCs w:val="24"/>
+          <w:lang w:val="es-AR"/>
+        </w:rPr>
+      </w:pPr>
+      <w:r>
+        <w:rPr>
+          <w:rFonts w:ascii="Aptos" w:hAnsi="Aptos" w:eastAsia="Aptos" w:cs="Aptos"/>
+          <w:b w:val="1"/>
+          <w:bCs w:val="1"/>
+          <w:i w:val="0"/>
+          <w:iCs w:val="0"/>
+          <w:caps w:val="0"/>
+          <w:smallCaps w:val="0"/>
+          <w:noProof w:val="0"/>
+          <w:color w:val="000000" w:themeColor="text1" w:themeTint="FF" w:themeShade="FF"/>
+          <w:sz w:val="24"/>
+          <w:szCs w:val="24"/>
+          <w:lang w:val="es-AR"/>
+        </w:rPr>
+        <w:t>RF05.</w:t>
+      </w:r>
+      <w:r>
+        <w:rPr>
+          <w:rFonts w:ascii="Aptos" w:hAnsi="Aptos" w:eastAsia="Aptos" w:cs="Aptos"/>
+          <w:b w:val="0"/>
+          <w:bCs w:val="0"/>
+          <w:i w:val="0"/>
+          <w:iCs w:val="0"/>
+          <w:caps w:val="0"/>
+          <w:smallCaps w:val="0"/>
+          <w:noProof w:val="0"/>
+          <w:color w:val="000000" w:themeColor="text1" w:themeTint="FF" w:themeShade="FF"/>
+          <w:sz w:val="24"/>
+          <w:szCs w:val="24"/>
+          <w:lang w:val="es-AR"/>
+        </w:rPr>
+        <w:t xml:space="preserve"> El sistema deberá permitir filtrar retiros por fecha.</w:t>
+      </w:r>
+    </w:p>
+    <w:p/>
     <w:sectPr>
       <w:pgSz w:w="11906" w:h="16838" w:orient="portrait"/>
       <w:pgMar w:top="1417" w:right="1701" w:bottom="1417" w:left="1701" w:header="708" w:footer="708" w:gutter="0"/>
@@ -970,6 +1329,126 @@
     </w:sectPr>
   </w:body>
 </w:document>
+</file>
+
+<file path=word/numbering.xml><?xml version="1.0" encoding="utf-8"?>
+<w:numbering xmlns:w="http://schemas.openxmlformats.org/wordprocessingml/2006/main">
+  <w:abstractNum xmlns:w="http://schemas.openxmlformats.org/wordprocessingml/2006/main" w:abstractNumId="1">
+    <w:nsid w:val="27988dfd"/>
+    <w:multiLevelType xmlns:w="http://schemas.openxmlformats.org/wordprocessingml/2006/main" w:val="multilevel"/>
+    <w:lvl xmlns:w="http://schemas.openxmlformats.org/wordprocessingml/2006/main" w:ilvl="0">
+      <w:start w:val="1"/>
+      <w:numFmt w:val="bullet"/>
+      <w:lvlText w:val=""/>
+      <w:lvlJc w:val="left"/>
+      <w:pPr>
+        <w:ind w:left="720" w:hanging="360"/>
+      </w:pPr>
+      <w:rPr>
+        <w:rFonts w:hint="default" w:ascii="Symbol" w:hAnsi="Symbol"/>
+      </w:rPr>
+    </w:lvl>
+    <w:lvl xmlns:w="http://schemas.openxmlformats.org/wordprocessingml/2006/main" w:ilvl="1">
+      <w:start w:val="1"/>
+      <w:numFmt w:val="bullet"/>
+      <w:lvlText w:val="o"/>
+      <w:lvlJc w:val="left"/>
+      <w:pPr>
+        <w:ind w:left="1440" w:hanging="360"/>
+      </w:pPr>
+      <w:rPr>
+        <w:rFonts w:hint="default" w:ascii="Courier New" w:hAnsi="Courier New"/>
+      </w:rPr>
+    </w:lvl>
+    <w:lvl xmlns:w="http://schemas.openxmlformats.org/wordprocessingml/2006/main" w:ilvl="2">
+      <w:start w:val="1"/>
+      <w:numFmt w:val="bullet"/>
+      <w:lvlText w:val=""/>
+      <w:lvlJc w:val="left"/>
+      <w:pPr>
+        <w:ind w:left="2160" w:hanging="360"/>
+      </w:pPr>
+      <w:rPr>
+        <w:rFonts w:hint="default" w:ascii="Wingdings" w:hAnsi="Wingdings"/>
+      </w:rPr>
+    </w:lvl>
+    <w:lvl xmlns:w="http://schemas.openxmlformats.org/wordprocessingml/2006/main" w:ilvl="3">
+      <w:start w:val="1"/>
+      <w:numFmt w:val="bullet"/>
+      <w:lvlText w:val=""/>
+      <w:lvlJc w:val="left"/>
+      <w:pPr>
+        <w:ind w:left="2880" w:hanging="360"/>
+      </w:pPr>
+      <w:rPr>
+        <w:rFonts w:hint="default" w:ascii="Symbol" w:hAnsi="Symbol"/>
+      </w:rPr>
+    </w:lvl>
+    <w:lvl xmlns:w="http://schemas.openxmlformats.org/wordprocessingml/2006/main" w:ilvl="4">
+      <w:start w:val="1"/>
+      <w:numFmt w:val="bullet"/>
+      <w:lvlText w:val="o"/>
+      <w:lvlJc w:val="left"/>
+      <w:pPr>
+        <w:ind w:left="3600" w:hanging="360"/>
+      </w:pPr>
+      <w:rPr>
+        <w:rFonts w:hint="default" w:ascii="Courier New" w:hAnsi="Courier New"/>
+      </w:rPr>
+    </w:lvl>
+    <w:lvl xmlns:w="http://schemas.openxmlformats.org/wordprocessingml/2006/main" w:ilvl="5">
+      <w:start w:val="1"/>
+      <w:numFmt w:val="bullet"/>
+      <w:lvlText w:val=""/>
+      <w:lvlJc w:val="left"/>
+      <w:pPr>
+        <w:ind w:left="4320" w:hanging="360"/>
+      </w:pPr>
+      <w:rPr>
+        <w:rFonts w:hint="default" w:ascii="Wingdings" w:hAnsi="Wingdings"/>
+      </w:rPr>
+    </w:lvl>
+    <w:lvl xmlns:w="http://schemas.openxmlformats.org/wordprocessingml/2006/main" w:ilvl="6">
+      <w:start w:val="1"/>
+      <w:numFmt w:val="bullet"/>
+      <w:lvlText w:val=""/>
+      <w:lvlJc w:val="left"/>
+      <w:pPr>
+        <w:ind w:left="5040" w:hanging="360"/>
+      </w:pPr>
+      <w:rPr>
+        <w:rFonts w:hint="default" w:ascii="Symbol" w:hAnsi="Symbol"/>
+      </w:rPr>
+    </w:lvl>
+    <w:lvl xmlns:w="http://schemas.openxmlformats.org/wordprocessingml/2006/main" w:ilvl="7">
+      <w:start w:val="1"/>
+      <w:numFmt w:val="bullet"/>
+      <w:lvlText w:val="o"/>
+      <w:lvlJc w:val="left"/>
+      <w:pPr>
+        <w:ind w:left="5760" w:hanging="360"/>
+      </w:pPr>
+      <w:rPr>
+        <w:rFonts w:hint="default" w:ascii="Courier New" w:hAnsi="Courier New"/>
+      </w:rPr>
+    </w:lvl>
+    <w:lvl xmlns:w="http://schemas.openxmlformats.org/wordprocessingml/2006/main" w:ilvl="8">
+      <w:start w:val="1"/>
+      <w:numFmt w:val="bullet"/>
+      <w:lvlText w:val=""/>
+      <w:lvlJc w:val="left"/>
+      <w:pPr>
+        <w:ind w:left="6480" w:hanging="360"/>
+      </w:pPr>
+      <w:rPr>
+        <w:rFonts w:hint="default" w:ascii="Wingdings" w:hAnsi="Wingdings"/>
+      </w:rPr>
+    </w:lvl>
+  </w:abstractNum>
+  <w:num w:numId="1">
+    <w:abstractNumId w:val="1"/>
+  </w:num>
+</w:numbering>
 </file>
 
 <file path=word/styles.xml><?xml version="1.0" encoding="utf-8"?>
@@ -1549,6 +2028,18 @@
       <w:szCs w:val="28"/>
     </w:rPr>
   </w:style>
+  <w:style w:type="paragraph" w:styleId="ListParagraph">
+    <w:uiPriority w:val="34"/>
+    <w:name w:val="List Paragraph"/>
+    <w:basedOn w:val="Normal"/>
+    <w:qFormat/>
+    <w:rsid w:val="6C71532B"/>
+    <w:pPr>
+      <w:spacing/>
+      <w:ind w:left="720"/>
+      <w:contextualSpacing/>
+    </w:pPr>
+  </w:style>
 </w:styles>
 </file>
 

</xml_diff>

<commit_message>
agrego 6 requerimientos funcionales
</commit_message>
<xml_diff>
--- a/Trabajo_ASI.docx
+++ b/Trabajo_ASI.docx
@@ -8,7 +8,7 @@
           <w:noProof/>
         </w:rPr>
         <w:drawing>
-          <wp:inline distT="0" distB="0" distL="0" distR="0" wp14:anchorId="6B0F2299" wp14:editId="3EAF253E">
+          <wp:inline distT="0" distB="0" distL="0" distR="0" wp14:anchorId="78F2AFBF" wp14:editId="114D1EBC">
             <wp:extent cx="5400040" cy="1077595"/>
             <wp:effectExtent l="0" t="0" r="0" b="0"/>
             <wp:docPr id="1" name="image1.png"/>
@@ -21,7 +21,7 @@
                     <pic:cNvPicPr preferRelativeResize="0"/>
                   </pic:nvPicPr>
                   <pic:blipFill>
-                    <a:blip r:embed="rId4"/>
+                    <a:blip r:embed="rId5"/>
                     <a:srcRect/>
                     <a:stretch>
                       <a:fillRect/>
@@ -219,7 +219,7 @@
         </w:rPr>
         <w:tab/>
       </w:r>
-      <w:hyperlink r:id="rId5">
+      <w:hyperlink r:id="rId6">
         <w:r>
           <w:rPr>
             <w:color w:val="467886"/>
@@ -243,7 +243,7 @@
       <w:r>
         <w:tab/>
       </w:r>
-      <w:hyperlink r:id="rId6">
+      <w:hyperlink r:id="rId7">
         <w:r>
           <w:rPr>
             <w:color w:val="467886"/>
@@ -274,7 +274,7 @@
       <w:r>
         <w:tab/>
       </w:r>
-      <w:hyperlink r:id="rId7">
+      <w:hyperlink r:id="rId8">
         <w:r>
           <w:rPr>
             <w:color w:val="467886"/>
@@ -296,7 +296,7 @@
         </w:rPr>
         <w:t xml:space="preserve">Romani, Laureano                                                </w:t>
       </w:r>
-      <w:hyperlink r:id="rId8">
+      <w:hyperlink r:id="rId9">
         <w:r>
           <w:rPr>
             <w:color w:val="467886"/>
@@ -318,7 +318,7 @@
         </w:rPr>
         <w:t xml:space="preserve">Gomez, Agustin                                                     </w:t>
       </w:r>
-      <w:hyperlink r:id="rId9">
+      <w:hyperlink r:id="rId10">
         <w:r>
           <w:rPr>
             <w:color w:val="467886"/>
@@ -340,7 +340,7 @@
         </w:rPr>
         <w:t xml:space="preserve">Gomez, Gaspar                                                      </w:t>
       </w:r>
-      <w:hyperlink r:id="rId10">
+      <w:hyperlink r:id="rId11">
         <w:r>
           <w:rPr>
             <w:color w:val="467886"/>
@@ -371,7 +371,7 @@
         </w:rPr>
         <w:t xml:space="preserve">, Augusto                                                 </w:t>
       </w:r>
-      <w:hyperlink r:id="rId11">
+      <w:hyperlink r:id="rId12">
         <w:r>
           <w:rPr>
             <w:color w:val="467886"/>
@@ -623,52 +623,29 @@
     <w:p>
       <w:pPr>
         <w:rPr>
-          <w:rFonts w:ascii="Calibri" w:eastAsia="Calibri" w:hAnsi="Calibri" w:cs="Calibri"/>
-          <w:b/>
-          <w:bCs/>
+          <w:color w:val="000000" w:themeColor="text1"/>
+        </w:rPr>
+      </w:pPr>
+      <w:r>
+        <w:rPr>
+          <w:b/>
+          <w:bCs/>
+          <w:color w:val="000000" w:themeColor="text1"/>
+        </w:rPr>
+        <w:t>Logotipo:</w:t>
+      </w:r>
+      <w:r>
+        <w:br/>
+      </w:r>
+      <w:r>
+        <w:rPr>
           <w:noProof/>
-          <w:color w:val="000000"/>
-        </w:rPr>
-      </w:pPr>
-      <w:r>
-        <w:rPr>
-          <w:rFonts w:ascii="Calibri" w:eastAsia="Calibri" w:hAnsi="Calibri" w:cs="Calibri"/>
-          <w:b/>
-          <w:bCs/>
-          <w:color w:val="000000"/>
-        </w:rPr>
-        <w:t>Logotipo:</w:t>
-      </w:r>
-      <w:r>
-        <w:rPr>
-          <w:rFonts w:ascii="Calibri" w:eastAsia="Calibri" w:hAnsi="Calibri" w:cs="Calibri"/>
-          <w:b/>
-          <w:bCs/>
-          <w:color w:val="000000"/>
-        </w:rPr>
-        <w:br/>
-      </w:r>
-    </w:p>
-    <w:p>
-      <w:pPr>
-        <w:rPr>
-          <w:b/>
-          <w:bCs/>
-        </w:rPr>
-      </w:pPr>
-      <w:r>
-        <w:rPr>
-          <w:rFonts w:ascii="Calibri" w:eastAsia="Calibri" w:hAnsi="Calibri" w:cs="Calibri"/>
-          <w:b/>
-          <w:bCs/>
-          <w:noProof/>
-          <w:color w:val="000000"/>
         </w:rPr>
         <w:drawing>
-          <wp:inline distT="0" distB="0" distL="0" distR="0" wp14:anchorId="118DE1BA" wp14:editId="17D50EF4">
-            <wp:extent cx="5897880" cy="3219643"/>
-            <wp:effectExtent l="0" t="0" r="7620" b="0"/>
-            <wp:docPr id="951131601" name="Imagen 2"/>
+          <wp:inline distT="0" distB="0" distL="0" distR="0" wp14:anchorId="0B155F9B" wp14:editId="4E017CEC">
+            <wp:extent cx="4572000" cy="2495550"/>
+            <wp:effectExtent l="0" t="0" r="0" b="0"/>
+            <wp:docPr id="1305419259" name="drawing"/>
             <wp:cNvGraphicFramePr>
               <a:graphicFrameLocks xmlns:a="http://schemas.openxmlformats.org/drawingml/2006/main" noChangeAspect="1"/>
             </wp:cNvGraphicFramePr>
@@ -676,33 +653,29 @@
               <a:graphicData uri="http://schemas.openxmlformats.org/drawingml/2006/picture">
                 <pic:pic xmlns:pic="http://schemas.openxmlformats.org/drawingml/2006/picture">
                   <pic:nvPicPr>
-                    <pic:cNvPr id="0" name="Picture 2"/>
-                    <pic:cNvPicPr>
-                      <a:picLocks noChangeAspect="1" noChangeArrowheads="1"/>
-                    </pic:cNvPicPr>
+                    <pic:cNvPr id="1305419259" name="Picture 1305419259"/>
+                    <pic:cNvPicPr/>
                   </pic:nvPicPr>
                   <pic:blipFill>
-                    <a:blip r:embed="rId12">
+                    <a:blip r:embed="rId13">
                       <a:extLst>
                         <a:ext uri="{28A0092B-C50C-407E-A947-70E740481C1C}">
-                          <a14:useLocalDpi xmlns:a14="http://schemas.microsoft.com/office/drawing/2010/main" val="0"/>
+                          <a14:useLocalDpi xmlns:a14="http://schemas.microsoft.com/office/drawing/2010/main"/>
                         </a:ext>
                       </a:extLst>
                     </a:blip>
-                    <a:srcRect/>
                     <a:stretch>
                       <a:fillRect/>
                     </a:stretch>
                   </pic:blipFill>
-                  <pic:spPr bwMode="auto">
+                  <pic:spPr>
                     <a:xfrm>
                       <a:off x="0" y="0"/>
-                      <a:ext cx="5913996" cy="3228441"/>
+                      <a:ext cx="4572000" cy="2495550"/>
                     </a:xfrm>
                     <a:prstGeom prst="rect">
                       <a:avLst/>
                     </a:prstGeom>
-                    <a:noFill/>
                   </pic:spPr>
                 </pic:pic>
               </a:graphicData>
@@ -711,98 +684,35 @@
         </w:drawing>
       </w:r>
     </w:p>
-    <w:p>
-      <w:pPr>
-        <w:rPr>
-          <w:b/>
-          <w:bCs/>
-        </w:rPr>
-      </w:pPr>
-    </w:p>
-    <w:p>
-      <w:pPr>
-        <w:rPr>
-          <w:b/>
-          <w:bCs/>
-        </w:rPr>
-      </w:pPr>
-    </w:p>
-    <w:p>
-      <w:pPr>
-        <w:rPr>
-          <w:b/>
-          <w:bCs/>
-        </w:rPr>
-      </w:pPr>
-    </w:p>
-    <w:p>
-      <w:pPr>
-        <w:rPr>
-          <w:b/>
-          <w:bCs/>
-        </w:rPr>
-      </w:pPr>
-    </w:p>
-    <w:p>
-      <w:pPr>
-        <w:rPr>
-          <w:b/>
-          <w:bCs/>
-        </w:rPr>
-      </w:pPr>
-    </w:p>
-    <w:p>
-      <w:pPr>
-        <w:rPr>
-          <w:b/>
-          <w:bCs/>
-        </w:rPr>
-      </w:pPr>
-    </w:p>
-    <w:p>
-      <w:pPr>
-        <w:rPr>
-          <w:b/>
-          <w:bCs/>
-        </w:rPr>
-      </w:pPr>
-    </w:p>
-    <w:p>
-      <w:pPr>
-        <w:rPr>
-          <w:b/>
-          <w:bCs/>
-        </w:rPr>
-      </w:pPr>
-    </w:p>
+    <w:p/>
     <w:p>
       <w:pPr>
         <w:pStyle w:val="Ttulo1"/>
       </w:pPr>
       <w:bookmarkStart w:id="2" w:name="_Toc1132945350"/>
       <w:r>
+        <w:t>Enunciado del caso (viaje del cliente)</w:t>
+      </w:r>
+      <w:bookmarkEnd w:id="2"/>
+    </w:p>
+    <w:p>
+      <w:r>
+        <w:t>Una usuaria desea participar en un retiro holístico junto a tres amigas. Actualmente la información de los distintos retiros se encuentra dispersa en páginas web, redes sociales y contactos personales, lo que dificulta la comparación y organización de las opciones disponibles.</w:t>
+      </w:r>
+    </w:p>
+    <w:p>
+      <w:r>
+        <w:t>La usuaria necesita una aplicación que le permita consultar retiros holísticos, visualizar información relevante como fechas, duración, actividades incluidas, costos, imágenes y datos de contacto. Además, desea comparar distintas alternativas para elegir la más conveniente según sus intereses y disponibilidad.</w:t>
+      </w:r>
+    </w:p>
+    <w:p>
+      <w:r>
+        <w:t>Al ingresar al sistema, la usuaria puede buscar retiros utilizando filtros por fecha, duración, ubicación o actividades. El sistema muestra los resultados disponibles junto con información detallada de cada retiro.</w:t>
+      </w:r>
+    </w:p>
+    <w:p>
+      <w:r>
         <w:lastRenderedPageBreak/>
-        <w:t>Enunciado del caso (viaje del cliente)</w:t>
-      </w:r>
-      <w:bookmarkEnd w:id="2"/>
-    </w:p>
-    <w:p>
-      <w:r>
-        <w:t>Una usuaria desea participar en un retiro holístico junto a tres amigas. Actualmente la información de los distintos retiros se encuentra dispersa en páginas web, redes sociales y contactos personales, lo que dificulta la comparación y organización de las opciones disponibles.</w:t>
-      </w:r>
-    </w:p>
-    <w:p>
-      <w:r>
-        <w:t>La usuaria necesita una aplicación que le permita consultar retiros holísticos, visualizar información relevante como fechas, duración, actividades incluidas, costos, imágenes y datos de contacto. Además, desea comparar distintas alternativas para elegir la más conveniente según sus intereses y disponibilidad.</w:t>
-      </w:r>
-    </w:p>
-    <w:p>
-      <w:r>
-        <w:t>Al ingresar al sistema, la usuaria puede buscar retiros utilizando filtros por fecha, duración, ubicación o actividades. El sistema muestra los resultados disponibles junto con información detallada de cada retiro.</w:t>
-      </w:r>
-    </w:p>
-    <w:p>
-      <w:r>
         <w:t>Una vez identificadas las opciones de interés, la usuaria puede compararlas para analizar diferencias en costos, actividades y fechas. Posteriormente selecciona un retiro y registra su participación.</w:t>
       </w:r>
     </w:p>
@@ -816,63 +726,361 @@
         <w:t>Luego de la inscripción, el sistema envía recordatorios sobre fechas de pago y otra información importante asociada al retiro seleccionado.</w:t>
       </w:r>
     </w:p>
+    <w:p>
+      <w:r>
+        <w:t>Finalmente, cuando se realiza el retiro y concluyen todas las actividades programadas, la usuaria conserva el historial y la información del evento para futuras consultas.</w:t>
+      </w:r>
+    </w:p>
+    <w:p>
+      <w:pPr>
+        <w:pStyle w:val="Ttulo1"/>
+        <w:rPr>
+          <w:color w:val="000000" w:themeColor="text1"/>
+        </w:rPr>
+      </w:pPr>
+      <w:r>
+        <w:rPr>
+          <w:color w:val="000000" w:themeColor="text1"/>
+        </w:rPr>
+        <w:t>Requerimientos funcionales</w:t>
+      </w:r>
+    </w:p>
+    <w:p>
+      <w:pPr>
+        <w:rPr>
+          <w:color w:val="000000" w:themeColor="text1"/>
+        </w:rPr>
+      </w:pPr>
+      <w:r>
+        <w:rPr>
+          <w:b/>
+          <w:bCs/>
+          <w:color w:val="000000" w:themeColor="text1"/>
+        </w:rPr>
+        <w:t>RF01.</w:t>
+      </w:r>
+      <w:r>
+        <w:rPr>
+          <w:color w:val="000000" w:themeColor="text1"/>
+        </w:rPr>
+        <w:t xml:space="preserve"> El sistema deberá permitir visualizar la lista de retiros disponibles.</w:t>
+      </w:r>
+    </w:p>
+    <w:p>
+      <w:pPr>
+        <w:rPr>
+          <w:color w:val="000000" w:themeColor="text1"/>
+        </w:rPr>
+      </w:pPr>
+      <w:r>
+        <w:rPr>
+          <w:b/>
+          <w:bCs/>
+          <w:color w:val="000000" w:themeColor="text1"/>
+        </w:rPr>
+        <w:t>RF02.</w:t>
+      </w:r>
+      <w:r>
+        <w:rPr>
+          <w:color w:val="000000" w:themeColor="text1"/>
+        </w:rPr>
+        <w:t xml:space="preserve"> El sistema deberá permitir registrar nuevos retiros.</w:t>
+      </w:r>
+    </w:p>
+    <w:p>
+      <w:pPr>
+        <w:rPr>
+          <w:color w:val="000000" w:themeColor="text1"/>
+        </w:rPr>
+      </w:pPr>
+      <w:r>
+        <w:rPr>
+          <w:b/>
+          <w:bCs/>
+          <w:color w:val="000000" w:themeColor="text1"/>
+        </w:rPr>
+        <w:t>RF03.</w:t>
+      </w:r>
+      <w:r>
+        <w:rPr>
+          <w:color w:val="000000" w:themeColor="text1"/>
+        </w:rPr>
+        <w:t xml:space="preserve"> El sistema deberá mostrar la información detallada de cada retiro, incluyendo:</w:t>
+      </w:r>
+    </w:p>
+    <w:p>
+      <w:pPr>
+        <w:pStyle w:val="Prrafodelista"/>
+        <w:numPr>
+          <w:ilvl w:val="0"/>
+          <w:numId w:val="1"/>
+        </w:numPr>
+        <w:rPr>
+          <w:color w:val="000000" w:themeColor="text1"/>
+        </w:rPr>
+      </w:pPr>
+      <w:r>
+        <w:rPr>
+          <w:color w:val="000000" w:themeColor="text1"/>
+        </w:rPr>
+        <w:t xml:space="preserve">Nombre. </w:t>
+      </w:r>
+    </w:p>
+    <w:p>
+      <w:pPr>
+        <w:pStyle w:val="Prrafodelista"/>
+        <w:numPr>
+          <w:ilvl w:val="0"/>
+          <w:numId w:val="1"/>
+        </w:numPr>
+        <w:rPr>
+          <w:color w:val="000000" w:themeColor="text1"/>
+        </w:rPr>
+      </w:pPr>
+      <w:r>
+        <w:rPr>
+          <w:color w:val="000000" w:themeColor="text1"/>
+        </w:rPr>
+        <w:t xml:space="preserve">Fecha. </w:t>
+      </w:r>
+    </w:p>
+    <w:p>
+      <w:pPr>
+        <w:pStyle w:val="Prrafodelista"/>
+        <w:numPr>
+          <w:ilvl w:val="0"/>
+          <w:numId w:val="1"/>
+        </w:numPr>
+        <w:rPr>
+          <w:color w:val="000000" w:themeColor="text1"/>
+        </w:rPr>
+      </w:pPr>
+      <w:r>
+        <w:rPr>
+          <w:color w:val="000000" w:themeColor="text1"/>
+        </w:rPr>
+        <w:t xml:space="preserve">Duración. </w:t>
+      </w:r>
+    </w:p>
+    <w:p>
+      <w:pPr>
+        <w:pStyle w:val="Prrafodelista"/>
+        <w:numPr>
+          <w:ilvl w:val="0"/>
+          <w:numId w:val="1"/>
+        </w:numPr>
+        <w:rPr>
+          <w:color w:val="000000" w:themeColor="text1"/>
+        </w:rPr>
+      </w:pPr>
+      <w:r>
+        <w:rPr>
+          <w:color w:val="000000" w:themeColor="text1"/>
+        </w:rPr>
+        <w:t xml:space="preserve">Actividades. </w:t>
+      </w:r>
+    </w:p>
+    <w:p>
+      <w:pPr>
+        <w:pStyle w:val="Prrafodelista"/>
+        <w:numPr>
+          <w:ilvl w:val="0"/>
+          <w:numId w:val="1"/>
+        </w:numPr>
+        <w:rPr>
+          <w:color w:val="000000" w:themeColor="text1"/>
+        </w:rPr>
+      </w:pPr>
+      <w:r>
+        <w:rPr>
+          <w:color w:val="000000" w:themeColor="text1"/>
+        </w:rPr>
+        <w:t xml:space="preserve">Costos. </w:t>
+      </w:r>
+    </w:p>
+    <w:p>
+      <w:pPr>
+        <w:pStyle w:val="Prrafodelista"/>
+        <w:numPr>
+          <w:ilvl w:val="0"/>
+          <w:numId w:val="1"/>
+        </w:numPr>
+        <w:rPr>
+          <w:color w:val="000000" w:themeColor="text1"/>
+        </w:rPr>
+      </w:pPr>
+      <w:r>
+        <w:rPr>
+          <w:color w:val="000000" w:themeColor="text1"/>
+        </w:rPr>
+        <w:t xml:space="preserve">Datos de contacto. </w:t>
+      </w:r>
+    </w:p>
+    <w:p>
+      <w:pPr>
+        <w:pStyle w:val="Prrafodelista"/>
+        <w:numPr>
+          <w:ilvl w:val="0"/>
+          <w:numId w:val="1"/>
+        </w:numPr>
+        <w:rPr>
+          <w:color w:val="000000" w:themeColor="text1"/>
+        </w:rPr>
+      </w:pPr>
+      <w:r>
+        <w:rPr>
+          <w:color w:val="000000" w:themeColor="text1"/>
+        </w:rPr>
+        <w:t xml:space="preserve">Página web asociada. </w:t>
+      </w:r>
+    </w:p>
+    <w:p>
+      <w:pPr>
+        <w:rPr>
+          <w:color w:val="000000" w:themeColor="text1"/>
+        </w:rPr>
+      </w:pPr>
+      <w:r>
+        <w:rPr>
+          <w:b/>
+          <w:bCs/>
+          <w:color w:val="000000" w:themeColor="text1"/>
+        </w:rPr>
+        <w:t>RF04.</w:t>
+      </w:r>
+      <w:r>
+        <w:rPr>
+          <w:color w:val="000000" w:themeColor="text1"/>
+        </w:rPr>
+        <w:t xml:space="preserve"> El sistema deberá mostrar imágenes asociadas a cada retiro.</w:t>
+      </w:r>
+    </w:p>
+    <w:p>
+      <w:pPr>
+        <w:rPr>
+          <w:b/>
+          <w:bCs/>
+        </w:rPr>
+      </w:pPr>
+      <w:r>
+        <w:rPr>
+          <w:b/>
+          <w:bCs/>
+          <w:color w:val="000000" w:themeColor="text1"/>
+        </w:rPr>
+        <w:t>RF05.</w:t>
+      </w:r>
+      <w:r>
+        <w:rPr>
+          <w:color w:val="000000" w:themeColor="text1"/>
+        </w:rPr>
+        <w:t xml:space="preserve"> El sistema deberá permitir filtrar retiros por fecha.</w:t>
+      </w:r>
+      <w:r>
+        <w:rPr>
+          <w:b/>
+          <w:bCs/>
+        </w:rPr>
+        <w:t xml:space="preserve"> </w:t>
+      </w:r>
+    </w:p>
+    <w:p>
+      <w:r>
+        <w:rPr>
+          <w:b/>
+          <w:bCs/>
+        </w:rPr>
+        <w:t>RF06.</w:t>
+      </w:r>
+      <w:r>
+        <w:t xml:space="preserve"> El sistema deberá permitir filtrar retiros por duración.</w:t>
+      </w:r>
+    </w:p>
+    <w:p>
+      <w:pPr>
+        <w:rPr>
+          <w:b/>
+          <w:bCs/>
+        </w:rPr>
+      </w:pPr>
+      <w:r>
+        <w:rPr>
+          <w:b/>
+          <w:bCs/>
+        </w:rPr>
+        <w:t xml:space="preserve">RF07. </w:t>
+      </w:r>
+      <w:r>
+        <w:t>El sistema deberá permitir filtrar retiros por ubicación.</w:t>
+      </w:r>
+    </w:p>
+    <w:p>
+      <w:r>
+        <w:rPr>
+          <w:b/>
+          <w:bCs/>
+        </w:rPr>
+        <w:t>RF08.</w:t>
+      </w:r>
+      <w:r>
+        <w:t xml:space="preserve"> El sistema deberá permitir filtrar retiros por actividades ofrecidas.</w:t>
+      </w:r>
+    </w:p>
+    <w:p>
+      <w:r>
+        <w:rPr>
+          <w:b/>
+          <w:bCs/>
+        </w:rPr>
+        <w:t>RF09.</w:t>
+      </w:r>
+      <w:r>
+        <w:t xml:space="preserve"> El sistema deberá permitir comparar dos o más retiros.</w:t>
+      </w:r>
+    </w:p>
+    <w:p>
+      <w:r>
+        <w:rPr>
+          <w:b/>
+          <w:bCs/>
+        </w:rPr>
+        <w:t>RF10.</w:t>
+      </w:r>
+      <w:r>
+        <w:t xml:space="preserve"> El sistema deberá permitir seleccionar un retiro para participar.</w:t>
+      </w:r>
+    </w:p>
+    <w:p>
+      <w:r>
+        <w:rPr>
+          <w:b/>
+          <w:bCs/>
+        </w:rPr>
+        <w:t>RF11.</w:t>
+      </w:r>
+      <w:r>
+        <w:t xml:space="preserve"> El sistema deberá permitir registrar acompañantes para un retiro.</w:t>
+      </w:r>
+    </w:p>
+    <w:p>
+      <w:pPr>
+        <w:rPr>
+          <w:color w:val="000000" w:themeColor="text1"/>
+        </w:rPr>
+      </w:pPr>
+      <w:r>
+        <w:rPr>
+          <w:b/>
+          <w:bCs/>
+        </w:rPr>
+        <w:lastRenderedPageBreak/>
+        <w:t>RF12.</w:t>
+      </w:r>
+      <w:r>
+        <w:t xml:space="preserve"> El sistema deberá limitar la cantidad de participantes registrados a cuatro personas</w:t>
+      </w:r>
+    </w:p>
     <w:p/>
-    <w:p>
-      <w:pPr>
-        <w:rPr>
-          <w:b/>
-          <w:bCs/>
-        </w:rPr>
-      </w:pPr>
-    </w:p>
-    <w:p>
-      <w:pPr>
-        <w:rPr>
-          <w:b/>
-          <w:bCs/>
-        </w:rPr>
-      </w:pPr>
-    </w:p>
-    <w:p>
-      <w:pPr>
-        <w:rPr>
-          <w:b/>
-          <w:bCs/>
-        </w:rPr>
-      </w:pPr>
-    </w:p>
-    <w:p>
-      <w:pPr>
-        <w:rPr>
-          <w:b/>
-          <w:bCs/>
-        </w:rPr>
-      </w:pPr>
-    </w:p>
-    <w:p>
-      <w:pPr>
-        <w:rPr>
-          <w:b/>
-          <w:bCs/>
-        </w:rPr>
-      </w:pPr>
-    </w:p>
-    <w:p>
-      <w:pPr>
-        <w:rPr>
-          <w:b/>
-          <w:bCs/>
-        </w:rPr>
-      </w:pPr>
-    </w:p>
-    <w:p>
-      <w:pPr>
-        <w:rPr>
-          <w:b/>
-          <w:bCs/>
-        </w:rPr>
-      </w:pPr>
-    </w:p>
     <w:sectPr>
       <w:pgSz w:w="11906" w:h="16838"/>
       <w:pgMar w:top="1417" w:right="1701" w:bottom="1417" w:left="1701" w:header="708" w:footer="708" w:gutter="0"/>
@@ -881,6 +1089,127 @@
     </w:sectPr>
   </w:body>
 </w:document>
+</file>
+
+<file path=word/numbering.xml><?xml version="1.0" encoding="utf-8"?>
+<w:numbering xmlns:wpc="http://schemas.microsoft.com/office/word/2010/wordprocessingCanvas" xmlns:cx="http://schemas.microsoft.com/office/drawing/2014/chartex" xmlns:cx1="http://schemas.microsoft.com/office/drawing/2015/9/8/chartex" xmlns:cx2="http://schemas.microsoft.com/office/drawing/2015/10/21/chartex" xmlns:cx3="http://schemas.microsoft.com/office/drawing/2016/5/9/chartex" xmlns:cx4="http://schemas.microsoft.com/office/drawing/2016/5/10/chartex" xmlns:cx5="http://schemas.microsoft.com/office/drawing/2016/5/11/chartex" xmlns:cx6="http://schemas.microsoft.com/office/drawing/2016/5/12/chartex" xmlns:cx7="http://schemas.microsoft.com/office/drawing/2016/5/13/chartex" xmlns:cx8="http://schemas.microsoft.com/office/drawing/2016/5/14/chartex" xmlns:mc="http://schemas.openxmlformats.org/markup-compatibility/2006" xmlns:aink="http://schemas.microsoft.com/office/drawing/2016/ink" xmlns:am3d="http://schemas.microsoft.com/office/drawing/2017/model3d" xmlns:o="urn:schemas-microsoft-com:office:office" xmlns:oel="http://schemas.microsoft.com/office/2019/extlst" xmlns:r="http://schemas.openxmlformats.org/officeDocument/2006/relationships" xmlns:m="http://schemas.openxmlformats.org/officeDocument/2006/math" xmlns:v="urn:schemas-microsoft-com:vml" xmlns:wp14="http://schemas.microsoft.com/office/word/2010/wordprocessingDrawing" xmlns:wp="http://schemas.openxmlformats.org/drawingml/2006/wordprocessingDrawing" xmlns:w10="urn:schemas-microsoft-com:office:word" xmlns:w="http://schemas.openxmlformats.org/wordprocessingml/2006/main" xmlns:w14="http://schemas.microsoft.com/office/word/2010/wordml" xmlns:w15="http://schemas.microsoft.com/office/word/2012/wordml" xmlns:w16cex="http://schemas.microsoft.com/office/word/2018/wordml/cex" xmlns:w16cid="http://schemas.microsoft.com/office/word/2016/wordml/cid" xmlns:w16="http://schemas.microsoft.com/office/word/2018/wordml" xmlns:w16du="http://schemas.microsoft.com/office/word/2023/wordml/word16du" xmlns:w16sdtdh="http://schemas.microsoft.com/office/word/2020/wordml/sdtdatahash" xmlns:w16sdtfl="http://schemas.microsoft.com/office/word/2024/wordml/sdtformatlock" xmlns:w16se="http://schemas.microsoft.com/office/word/2015/wordml/symex" xmlns:wpg="http://schemas.microsoft.com/office/word/2010/wordprocessingGroup" xmlns:wpi="http://schemas.microsoft.com/office/word/2010/wordprocessingInk" xmlns:wne="http://schemas.microsoft.com/office/word/2006/wordml" xmlns:wps="http://schemas.microsoft.com/office/word/2010/wordprocessingShape" mc:Ignorable="w14 w15 w16se w16cid w16 w16cex w16sdtdh w16sdtfl w16du wp14">
+  <w:abstractNum w:abstractNumId="0" w15:restartNumberingAfterBreak="0">
+    <w:nsid w:val="27988DFD"/>
+    <w:multiLevelType w:val="multilevel"/>
+    <w:tmpl w:val="92C2B07E"/>
+    <w:lvl w:ilvl="0">
+      <w:start w:val="1"/>
+      <w:numFmt w:val="bullet"/>
+      <w:lvlText w:val=""/>
+      <w:lvlJc w:val="left"/>
+      <w:pPr>
+        <w:ind w:left="720" w:hanging="360"/>
+      </w:pPr>
+      <w:rPr>
+        <w:rFonts w:ascii="Symbol" w:hAnsi="Symbol" w:hint="default"/>
+      </w:rPr>
+    </w:lvl>
+    <w:lvl w:ilvl="1">
+      <w:start w:val="1"/>
+      <w:numFmt w:val="bullet"/>
+      <w:lvlText w:val="o"/>
+      <w:lvlJc w:val="left"/>
+      <w:pPr>
+        <w:ind w:left="1440" w:hanging="360"/>
+      </w:pPr>
+      <w:rPr>
+        <w:rFonts w:ascii="Courier New" w:hAnsi="Courier New" w:hint="default"/>
+      </w:rPr>
+    </w:lvl>
+    <w:lvl w:ilvl="2">
+      <w:start w:val="1"/>
+      <w:numFmt w:val="bullet"/>
+      <w:lvlText w:val=""/>
+      <w:lvlJc w:val="left"/>
+      <w:pPr>
+        <w:ind w:left="2160" w:hanging="360"/>
+      </w:pPr>
+      <w:rPr>
+        <w:rFonts w:ascii="Wingdings" w:hAnsi="Wingdings" w:hint="default"/>
+      </w:rPr>
+    </w:lvl>
+    <w:lvl w:ilvl="3">
+      <w:start w:val="1"/>
+      <w:numFmt w:val="bullet"/>
+      <w:lvlText w:val=""/>
+      <w:lvlJc w:val="left"/>
+      <w:pPr>
+        <w:ind w:left="2880" w:hanging="360"/>
+      </w:pPr>
+      <w:rPr>
+        <w:rFonts w:ascii="Symbol" w:hAnsi="Symbol" w:hint="default"/>
+      </w:rPr>
+    </w:lvl>
+    <w:lvl w:ilvl="4">
+      <w:start w:val="1"/>
+      <w:numFmt w:val="bullet"/>
+      <w:lvlText w:val="o"/>
+      <w:lvlJc w:val="left"/>
+      <w:pPr>
+        <w:ind w:left="3600" w:hanging="360"/>
+      </w:pPr>
+      <w:rPr>
+        <w:rFonts w:ascii="Courier New" w:hAnsi="Courier New" w:hint="default"/>
+      </w:rPr>
+    </w:lvl>
+    <w:lvl w:ilvl="5">
+      <w:start w:val="1"/>
+      <w:numFmt w:val="bullet"/>
+      <w:lvlText w:val=""/>
+      <w:lvlJc w:val="left"/>
+      <w:pPr>
+        <w:ind w:left="4320" w:hanging="360"/>
+      </w:pPr>
+      <w:rPr>
+        <w:rFonts w:ascii="Wingdings" w:hAnsi="Wingdings" w:hint="default"/>
+      </w:rPr>
+    </w:lvl>
+    <w:lvl w:ilvl="6">
+      <w:start w:val="1"/>
+      <w:numFmt w:val="bullet"/>
+      <w:lvlText w:val=""/>
+      <w:lvlJc w:val="left"/>
+      <w:pPr>
+        <w:ind w:left="5040" w:hanging="360"/>
+      </w:pPr>
+      <w:rPr>
+        <w:rFonts w:ascii="Symbol" w:hAnsi="Symbol" w:hint="default"/>
+      </w:rPr>
+    </w:lvl>
+    <w:lvl w:ilvl="7">
+      <w:start w:val="1"/>
+      <w:numFmt w:val="bullet"/>
+      <w:lvlText w:val="o"/>
+      <w:lvlJc w:val="left"/>
+      <w:pPr>
+        <w:ind w:left="5760" w:hanging="360"/>
+      </w:pPr>
+      <w:rPr>
+        <w:rFonts w:ascii="Courier New" w:hAnsi="Courier New" w:hint="default"/>
+      </w:rPr>
+    </w:lvl>
+    <w:lvl w:ilvl="8">
+      <w:start w:val="1"/>
+      <w:numFmt w:val="bullet"/>
+      <w:lvlText w:val=""/>
+      <w:lvlJc w:val="left"/>
+      <w:pPr>
+        <w:ind w:left="6480" w:hanging="360"/>
+      </w:pPr>
+      <w:rPr>
+        <w:rFonts w:ascii="Wingdings" w:hAnsi="Wingdings" w:hint="default"/>
+      </w:rPr>
+    </w:lvl>
+  </w:abstractNum>
+  <w:num w:numId="1" w16cid:durableId="607539876">
+    <w:abstractNumId w:val="0"/>
+  </w:num>
+</w:numbering>
 </file>
 
 <file path=word/styles.xml><?xml version="1.0" encoding="utf-8"?>
@@ -1460,6 +1789,17 @@
       <w:szCs w:val="28"/>
     </w:rPr>
   </w:style>
+  <w:style w:type="paragraph" w:styleId="Prrafodelista">
+    <w:name w:val="List Paragraph"/>
+    <w:basedOn w:val="Normal"/>
+    <w:uiPriority w:val="34"/>
+    <w:qFormat/>
+    <w:rsid w:val="6C71532B"/>
+    <w:pPr>
+      <w:ind w:left="720"/>
+      <w:contextualSpacing/>
+    </w:pPr>
+  </w:style>
 </w:styles>
 </file>
 

</xml_diff>

<commit_message>
Agrego los requerimientos funcionales restantes del 13 al 17
</commit_message>
<xml_diff>
--- a/Trabajo_ASI.docx
+++ b/Trabajo_ASI.docx
@@ -357,19 +357,11 @@
       </w:r>
     </w:p>
     <w:p>
-      <w:proofErr w:type="spellStart"/>
       <w:r>
         <w:rPr>
           <w:color w:val="000000"/>
         </w:rPr>
-        <w:t>Muriado</w:t>
-      </w:r>
-      <w:proofErr w:type="spellEnd"/>
-      <w:r>
-        <w:rPr>
-          <w:color w:val="000000"/>
-        </w:rPr>
-        <w:t xml:space="preserve">, Augusto                                                 </w:t>
+        <w:t xml:space="preserve">Muriado, Augusto                                                 </w:t>
       </w:r>
       <w:hyperlink r:id="rId12">
         <w:r>
@@ -567,7 +559,7 @@
     </w:p>
     <w:p>
       <w:pPr>
-        <w:pStyle w:val="Ttulo1"/>
+        <w:pStyle w:val="Heading1"/>
         <w:rPr>
           <w:sz w:val="32"/>
           <w:szCs w:val="32"/>
@@ -687,7 +679,7 @@
     <w:p/>
     <w:p>
       <w:pPr>
-        <w:pStyle w:val="Ttulo1"/>
+        <w:pStyle w:val="Heading1"/>
       </w:pPr>
       <w:bookmarkStart w:id="2" w:name="_Toc1132945350"/>
       <w:r>
@@ -733,7 +725,7 @@
     </w:p>
     <w:p>
       <w:pPr>
-        <w:pStyle w:val="Ttulo1"/>
+        <w:pStyle w:val="Heading1"/>
         <w:rPr>
           <w:color w:val="000000" w:themeColor="text1"/>
         </w:rPr>
@@ -810,7 +802,7 @@
     </w:p>
     <w:p>
       <w:pPr>
-        <w:pStyle w:val="Prrafodelista"/>
+        <w:pStyle w:val="ListParagraph"/>
         <w:numPr>
           <w:ilvl w:val="0"/>
           <w:numId w:val="1"/>
@@ -828,7 +820,7 @@
     </w:p>
     <w:p>
       <w:pPr>
-        <w:pStyle w:val="Prrafodelista"/>
+        <w:pStyle w:val="ListParagraph"/>
         <w:numPr>
           <w:ilvl w:val="0"/>
           <w:numId w:val="1"/>
@@ -846,7 +838,7 @@
     </w:p>
     <w:p>
       <w:pPr>
-        <w:pStyle w:val="Prrafodelista"/>
+        <w:pStyle w:val="ListParagraph"/>
         <w:numPr>
           <w:ilvl w:val="0"/>
           <w:numId w:val="1"/>
@@ -864,7 +856,7 @@
     </w:p>
     <w:p>
       <w:pPr>
-        <w:pStyle w:val="Prrafodelista"/>
+        <w:pStyle w:val="ListParagraph"/>
         <w:numPr>
           <w:ilvl w:val="0"/>
           <w:numId w:val="1"/>
@@ -882,7 +874,7 @@
     </w:p>
     <w:p>
       <w:pPr>
-        <w:pStyle w:val="Prrafodelista"/>
+        <w:pStyle w:val="ListParagraph"/>
         <w:numPr>
           <w:ilvl w:val="0"/>
           <w:numId w:val="1"/>
@@ -900,7 +892,7 @@
     </w:p>
     <w:p>
       <w:pPr>
-        <w:pStyle w:val="Prrafodelista"/>
+        <w:pStyle w:val="ListParagraph"/>
         <w:numPr>
           <w:ilvl w:val="0"/>
           <w:numId w:val="1"/>
@@ -918,7 +910,7 @@
     </w:p>
     <w:p>
       <w:pPr>
-        <w:pStyle w:val="Prrafodelista"/>
+        <w:pStyle w:val="ListParagraph"/>
         <w:numPr>
           <w:ilvl w:val="0"/>
           <w:numId w:val="1"/>
@@ -1063,11 +1055,6 @@
       </w:r>
     </w:p>
     <w:p>
-      <w:pPr>
-        <w:rPr>
-          <w:color w:val="000000" w:themeColor="text1"/>
-        </w:rPr>
-      </w:pPr>
       <w:r>
         <w:rPr>
           <w:b/>
@@ -1078,6 +1065,142 @@
       </w:r>
       <w:r>
         <w:t xml:space="preserve"> El sistema deberá limitar la cantidad de participantes registrados a cuatro personas</w:t>
+      </w:r>
+    </w:p>
+    <w:p>
+      <w:pPr>
+        <w:rPr>
+          <w:color w:val="000000" w:themeColor="text1"/>
+        </w:rPr>
+      </w:pPr>
+      <w:r>
+        <w:rPr>
+          <w:b/>
+          <w:bCs/>
+          <w:color w:val="000000" w:themeColor="text1"/>
+        </w:rPr>
+        <w:t>RF13.</w:t>
+      </w:r>
+      <w:r>
+        <w:rPr>
+          <w:color w:val="000000" w:themeColor="text1"/>
+        </w:rPr>
+        <w:t xml:space="preserve"> El sistema deberá permitir registrar información de pagos asociados a un retiro.</w:t>
+      </w:r>
+    </w:p>
+    <w:p>
+      <w:pPr>
+        <w:rPr>
+          <w:color w:val="000000" w:themeColor="text1"/>
+        </w:rPr>
+      </w:pPr>
+      <w:r>
+        <w:rPr>
+          <w:b/>
+          <w:bCs/>
+          <w:color w:val="000000" w:themeColor="text1"/>
+        </w:rPr>
+        <w:t>RF14.</w:t>
+      </w:r>
+      <w:r>
+        <w:rPr>
+          <w:color w:val="000000" w:themeColor="text1"/>
+        </w:rPr>
+        <w:t xml:space="preserve"> El sistema deberá generar recordatorios de vencimiento de pagos.</w:t>
+      </w:r>
+    </w:p>
+    <w:p>
+      <w:pPr>
+        <w:rPr>
+          <w:color w:val="000000" w:themeColor="text1"/>
+        </w:rPr>
+      </w:pPr>
+      <w:r>
+        <w:rPr>
+          <w:b/>
+          <w:bCs/>
+          <w:color w:val="000000" w:themeColor="text1"/>
+        </w:rPr>
+        <w:t>RF15.</w:t>
+      </w:r>
+      <w:r>
+        <w:rPr>
+          <w:color w:val="000000" w:themeColor="text1"/>
+        </w:rPr>
+        <w:t xml:space="preserve"> El sistema deberá generar recordatorios con información relevante del retiro.</w:t>
+      </w:r>
+    </w:p>
+    <w:p>
+      <w:pPr>
+        <w:rPr>
+          <w:color w:val="000000" w:themeColor="text1"/>
+        </w:rPr>
+      </w:pPr>
+      <w:r>
+        <w:rPr>
+          <w:b/>
+          <w:bCs/>
+          <w:color w:val="000000" w:themeColor="text1"/>
+        </w:rPr>
+        <w:t>RF16.</w:t>
+      </w:r>
+      <w:r>
+        <w:rPr>
+          <w:color w:val="000000" w:themeColor="text1"/>
+        </w:rPr>
+        <w:t xml:space="preserve"> El sistema deberá permitir visualizar los retiros organizados por mes o por rango de fechas.</w:t>
+      </w:r>
+    </w:p>
+    <w:p>
+      <w:pPr>
+        <w:rPr>
+          <w:color w:val="000000" w:themeColor="text1"/>
+        </w:rPr>
+      </w:pPr>
+      <w:r>
+        <w:rPr>
+          <w:b/>
+          <w:bCs/>
+          <w:color w:val="000000" w:themeColor="text1"/>
+        </w:rPr>
+        <w:t>RF17.</w:t>
+      </w:r>
+      <w:r>
+        <w:rPr>
+          <w:color w:val="000000" w:themeColor="text1"/>
+        </w:rPr>
+        <w:t xml:space="preserve"> El sistema deberá almacenar el historial de retiros seleccionados.</w:t>
+      </w:r>
+    </w:p>
+    <w:p>
+      <w:pPr>
+        <w:rPr>
+          <w:color w:val="000000" w:themeColor="text1"/>
+        </w:rPr>
+      </w:pPr>
+      <w:r>
+        <w:rPr>
+          <w:color w:val="000000" w:themeColor="text1"/>
+        </w:rPr>
+        <w:br w:type="page"/>
+      </w:r>
+    </w:p>
+    <w:p>
+      <w:pPr>
+        <w:rPr>
+          <w:b/>
+          <w:bCs/>
+          <w:color w:val="000000" w:themeColor="text1"/>
+        </w:rPr>
+      </w:pPr>
+      <w:r>
+        <w:rPr>
+          <w:b/>
+          <w:bCs/>
+          <w:color w:val="000000" w:themeColor="text1"/>
+        </w:rPr>
+        <w:lastRenderedPageBreak/>
+        <w:t>Anexo:</w:t>
       </w:r>
     </w:p>
     <w:p/>
@@ -1611,7 +1734,7 @@
     <w:name w:val="Normal"/>
     <w:qFormat/>
   </w:style>
-  <w:style w:type="paragraph" w:styleId="Ttulo1">
+  <w:style w:type="paragraph" w:styleId="Heading1">
     <w:name w:val="heading 1"/>
     <w:basedOn w:val="Normal"/>
     <w:next w:val="Normal"/>
@@ -1625,7 +1748,7 @@
       <w:bCs/>
     </w:rPr>
   </w:style>
-  <w:style w:type="paragraph" w:styleId="Ttulo2">
+  <w:style w:type="paragraph" w:styleId="Heading2">
     <w:name w:val="heading 2"/>
     <w:basedOn w:val="Normal"/>
     <w:next w:val="Normal"/>
@@ -1646,7 +1769,7 @@
       <w:szCs w:val="32"/>
     </w:rPr>
   </w:style>
-  <w:style w:type="paragraph" w:styleId="Ttulo3">
+  <w:style w:type="paragraph" w:styleId="Heading3">
     <w:name w:val="heading 3"/>
     <w:basedOn w:val="Normal"/>
     <w:next w:val="Normal"/>
@@ -1666,7 +1789,7 @@
       <w:szCs w:val="28"/>
     </w:rPr>
   </w:style>
-  <w:style w:type="paragraph" w:styleId="Ttulo4">
+  <w:style w:type="paragraph" w:styleId="Heading4">
     <w:name w:val="heading 4"/>
     <w:basedOn w:val="Normal"/>
     <w:next w:val="Normal"/>
@@ -1686,7 +1809,7 @@
       <w:color w:val="0F4761"/>
     </w:rPr>
   </w:style>
-  <w:style w:type="paragraph" w:styleId="Ttulo5">
+  <w:style w:type="paragraph" w:styleId="Heading5">
     <w:name w:val="heading 5"/>
     <w:basedOn w:val="Normal"/>
     <w:next w:val="Normal"/>
@@ -1704,7 +1827,7 @@
       <w:color w:val="0F4761"/>
     </w:rPr>
   </w:style>
-  <w:style w:type="paragraph" w:styleId="Ttulo6">
+  <w:style w:type="paragraph" w:styleId="Heading6">
     <w:name w:val="heading 6"/>
     <w:basedOn w:val="Normal"/>
     <w:next w:val="Normal"/>
@@ -1724,13 +1847,12 @@
       <w:color w:val="595959"/>
     </w:rPr>
   </w:style>
-  <w:style w:type="character" w:default="1" w:styleId="Fuentedeprrafopredeter">
+  <w:style w:type="character" w:default="1" w:styleId="DefaultParagraphFont">
     <w:name w:val="Default Paragraph Font"/>
     <w:uiPriority w:val="1"/>
-    <w:semiHidden/>
     <w:unhideWhenUsed/>
   </w:style>
-  <w:style w:type="table" w:default="1" w:styleId="Tablanormal">
+  <w:style w:type="table" w:default="1" w:styleId="TableNormal">
     <w:name w:val="Normal Table"/>
     <w:uiPriority w:val="99"/>
     <w:semiHidden/>
@@ -1745,13 +1867,13 @@
       </w:tblCellMar>
     </w:tblPr>
   </w:style>
-  <w:style w:type="numbering" w:default="1" w:styleId="Sinlista">
+  <w:style w:type="numbering" w:default="1" w:styleId="NoList">
     <w:name w:val="No List"/>
     <w:uiPriority w:val="99"/>
     <w:semiHidden/>
     <w:unhideWhenUsed/>
   </w:style>
-  <w:style w:type="table" w:customStyle="1" w:styleId="TableNormal">
+  <w:style w:type="table" w:customStyle="1" w:styleId="TableNormal0">
     <w:name w:val="TableNormal"/>
     <w:tblPr>
       <w:tblCellMar>
@@ -1762,7 +1884,7 @@
       </w:tblCellMar>
     </w:tblPr>
   </w:style>
-  <w:style w:type="paragraph" w:styleId="Ttulo">
+  <w:style w:type="paragraph" w:styleId="Title">
     <w:name w:val="Title"/>
     <w:basedOn w:val="Normal"/>
     <w:next w:val="Normal"/>
@@ -1777,7 +1899,7 @@
       <w:szCs w:val="56"/>
     </w:rPr>
   </w:style>
-  <w:style w:type="paragraph" w:styleId="Subttulo">
+  <w:style w:type="paragraph" w:styleId="Subtitle">
     <w:name w:val="Subtitle"/>
     <w:basedOn w:val="Normal"/>
     <w:next w:val="Normal"/>
@@ -1789,7 +1911,7 @@
       <w:szCs w:val="28"/>
     </w:rPr>
   </w:style>
-  <w:style w:type="paragraph" w:styleId="Prrafodelista">
+  <w:style w:type="paragraph" w:styleId="ListParagraph">
     <w:name w:val="List Paragraph"/>
     <w:basedOn w:val="Normal"/>
     <w:uiPriority w:val="34"/>

</xml_diff>

<commit_message>
Agrego los requerimientos restantes 13 a 17
</commit_message>
<xml_diff>
--- a/Trabajo_ASI.docx
+++ b/Trabajo_ASI.docx
@@ -1055,6 +1055,11 @@
       </w:r>
     </w:p>
     <w:p>
+      <w:pPr>
+        <w:rPr>
+          <w:color w:val="000000" w:themeColor="text1"/>
+        </w:rPr>
+      </w:pPr>
       <w:r>
         <w:rPr>
           <w:b/>
@@ -1068,142 +1073,76 @@
       </w:r>
     </w:p>
     <w:p>
-      <w:pPr>
-        <w:rPr>
-          <w:color w:val="000000" w:themeColor="text1"/>
-        </w:rPr>
-      </w:pPr>
-      <w:r>
-        <w:rPr>
-          <w:b/>
-          <w:bCs/>
-          <w:color w:val="000000" w:themeColor="text1"/>
+      <w:r>
+        <w:rPr>
+          <w:b/>
+          <w:bCs/>
         </w:rPr>
         <w:t>RF13.</w:t>
       </w:r>
       <w:r>
-        <w:rPr>
-          <w:color w:val="000000" w:themeColor="text1"/>
-        </w:rPr>
         <w:t xml:space="preserve"> El sistema deberá permitir registrar información de pagos asociados a un retiro.</w:t>
       </w:r>
     </w:p>
     <w:p>
-      <w:pPr>
-        <w:rPr>
-          <w:color w:val="000000" w:themeColor="text1"/>
-        </w:rPr>
-      </w:pPr>
-      <w:r>
-        <w:rPr>
-          <w:b/>
-          <w:bCs/>
-          <w:color w:val="000000" w:themeColor="text1"/>
+      <w:r>
+        <w:rPr>
+          <w:b/>
+          <w:bCs/>
         </w:rPr>
         <w:t>RF14.</w:t>
       </w:r>
       <w:r>
-        <w:rPr>
-          <w:color w:val="000000" w:themeColor="text1"/>
-        </w:rPr>
         <w:t xml:space="preserve"> El sistema deberá generar recordatorios de vencimiento de pagos.</w:t>
       </w:r>
     </w:p>
     <w:p>
-      <w:pPr>
-        <w:rPr>
-          <w:color w:val="000000" w:themeColor="text1"/>
-        </w:rPr>
-      </w:pPr>
-      <w:r>
-        <w:rPr>
-          <w:b/>
-          <w:bCs/>
-          <w:color w:val="000000" w:themeColor="text1"/>
+      <w:r>
+        <w:rPr>
+          <w:b/>
+          <w:bCs/>
         </w:rPr>
         <w:t>RF15.</w:t>
       </w:r>
       <w:r>
-        <w:rPr>
-          <w:color w:val="000000" w:themeColor="text1"/>
-        </w:rPr>
         <w:t xml:space="preserve"> El sistema deberá generar recordatorios con información relevante del retiro.</w:t>
       </w:r>
     </w:p>
     <w:p>
-      <w:pPr>
-        <w:rPr>
-          <w:color w:val="000000" w:themeColor="text1"/>
-        </w:rPr>
-      </w:pPr>
-      <w:r>
-        <w:rPr>
-          <w:b/>
-          <w:bCs/>
-          <w:color w:val="000000" w:themeColor="text1"/>
+      <w:r>
+        <w:rPr>
+          <w:b/>
+          <w:bCs/>
         </w:rPr>
         <w:t>RF16.</w:t>
       </w:r>
       <w:r>
-        <w:rPr>
-          <w:color w:val="000000" w:themeColor="text1"/>
-        </w:rPr>
         <w:t xml:space="preserve"> El sistema deberá permitir visualizar los retiros organizados por mes o por rango de fechas.</w:t>
       </w:r>
     </w:p>
     <w:p>
-      <w:pPr>
-        <w:rPr>
-          <w:color w:val="000000" w:themeColor="text1"/>
-        </w:rPr>
-      </w:pPr>
-      <w:r>
-        <w:rPr>
-          <w:b/>
-          <w:bCs/>
-          <w:color w:val="000000" w:themeColor="text1"/>
+      <w:r>
+        <w:rPr>
+          <w:b/>
+          <w:bCs/>
         </w:rPr>
         <w:t>RF17.</w:t>
       </w:r>
       <w:r>
-        <w:rPr>
-          <w:color w:val="000000" w:themeColor="text1"/>
-        </w:rPr>
         <w:t xml:space="preserve"> El sistema deberá almacenar el historial de retiros seleccionados.</w:t>
       </w:r>
     </w:p>
     <w:p>
-      <w:pPr>
-        <w:rPr>
-          <w:color w:val="000000" w:themeColor="text1"/>
-        </w:rPr>
-      </w:pPr>
-      <w:r>
-        <w:rPr>
-          <w:color w:val="000000" w:themeColor="text1"/>
-        </w:rPr>
+      <w:r>
         <w:br w:type="page"/>
       </w:r>
     </w:p>
     <w:p>
-      <w:pPr>
-        <w:rPr>
-          <w:b/>
-          <w:bCs/>
-          <w:color w:val="000000" w:themeColor="text1"/>
-        </w:rPr>
-      </w:pPr>
-      <w:r>
-        <w:rPr>
-          <w:b/>
-          <w:bCs/>
-          <w:color w:val="000000" w:themeColor="text1"/>
-        </w:rPr>
+      <w:r>
         <w:lastRenderedPageBreak/>
         <w:t>Anexo:</w:t>
       </w:r>
     </w:p>
-    <w:p/>
     <w:sectPr>
       <w:pgSz w:w="11906" w:h="16838"/>
       <w:pgMar w:top="1417" w:right="1701" w:bottom="1417" w:left="1701" w:header="708" w:footer="708" w:gutter="0"/>
@@ -1850,6 +1789,7 @@
   <w:style w:type="character" w:default="1" w:styleId="DefaultParagraphFont">
     <w:name w:val="Default Paragraph Font"/>
     <w:uiPriority w:val="1"/>
+    <w:semiHidden/>
     <w:unhideWhenUsed/>
   </w:style>
   <w:style w:type="table" w:default="1" w:styleId="TableNormal">

</xml_diff>

<commit_message>
Agrego el rf n15 y modifique el n14
</commit_message>
<xml_diff>
--- a/Trabajo_ASI.docx
+++ b/Trabajo_ASI.docx
@@ -1,6 +1,6 @@
 
 <file path=word/document.xml><?xml version="1.0" encoding="utf-8"?>
-<w:document xmlns:wpc="http://schemas.microsoft.com/office/word/2010/wordprocessingCanvas" xmlns:cx="http://schemas.microsoft.com/office/drawing/2014/chartex" xmlns:cx1="http://schemas.microsoft.com/office/drawing/2015/9/8/chartex" xmlns:cx2="http://schemas.microsoft.com/office/drawing/2015/10/21/chartex" xmlns:cx3="http://schemas.microsoft.com/office/drawing/2016/5/9/chartex" xmlns:cx4="http://schemas.microsoft.com/office/drawing/2016/5/10/chartex" xmlns:cx5="http://schemas.microsoft.com/office/drawing/2016/5/11/chartex" xmlns:cx6="http://schemas.microsoft.com/office/drawing/2016/5/12/chartex" xmlns:cx7="http://schemas.microsoft.com/office/drawing/2016/5/13/chartex" xmlns:cx8="http://schemas.microsoft.com/office/drawing/2016/5/14/chartex" xmlns:mc="http://schemas.openxmlformats.org/markup-compatibility/2006" xmlns:aink="http://schemas.microsoft.com/office/drawing/2016/ink" xmlns:am3d="http://schemas.microsoft.com/office/drawing/2017/model3d" xmlns:o="urn:schemas-microsoft-com:office:office" xmlns:oel="http://schemas.microsoft.com/office/2019/extlst" xmlns:r="http://schemas.openxmlformats.org/officeDocument/2006/relationships" xmlns:m="http://schemas.openxmlformats.org/officeDocument/2006/math" xmlns:v="urn:schemas-microsoft-com:vml" xmlns:wp14="http://schemas.microsoft.com/office/word/2010/wordprocessingDrawing" xmlns:wp="http://schemas.openxmlformats.org/drawingml/2006/wordprocessingDrawing" xmlns:w10="urn:schemas-microsoft-com:office:word" xmlns:w="http://schemas.openxmlformats.org/wordprocessingml/2006/main" xmlns:w14="http://schemas.microsoft.com/office/word/2010/wordml" xmlns:w15="http://schemas.microsoft.com/office/word/2012/wordml" xmlns:w16cex="http://schemas.microsoft.com/office/word/2018/wordml/cex" xmlns:w16cid="http://schemas.microsoft.com/office/word/2016/wordml/cid" xmlns:w16="http://schemas.microsoft.com/office/word/2018/wordml" xmlns:w16du="http://schemas.microsoft.com/office/word/2023/wordml/word16du" xmlns:w16sdtdh="http://schemas.microsoft.com/office/word/2020/wordml/sdtdatahash" xmlns:w16sdtfl="http://schemas.microsoft.com/office/word/2024/wordml/sdtformatlock" xmlns:w16se="http://schemas.microsoft.com/office/word/2015/wordml/symex" xmlns:wpg="http://schemas.microsoft.com/office/word/2010/wordprocessingGroup" xmlns:wpi="http://schemas.microsoft.com/office/word/2010/wordprocessingInk" xmlns:wne="http://schemas.microsoft.com/office/word/2006/wordml" xmlns:wps="http://schemas.microsoft.com/office/word/2010/wordprocessingShape" xmlns:a="http://schemas.openxmlformats.org/drawingml/2006/main" xmlns:pic="http://schemas.openxmlformats.org/drawingml/2006/picture" xmlns:a14="http://schemas.microsoft.com/office/drawing/2010/main" mc:Ignorable="w14 w15 w16se w16cid w16 w16cex w16sdtdh w16sdtfl w16du wp14">
+<w:document xmlns:wpc="http://schemas.microsoft.com/office/word/2010/wordprocessingCanvas" xmlns:cx="http://schemas.microsoft.com/office/drawing/2014/chartex" xmlns:cx1="http://schemas.microsoft.com/office/drawing/2015/9/8/chartex" xmlns:cx2="http://schemas.microsoft.com/office/drawing/2015/10/21/chartex" xmlns:cx3="http://schemas.microsoft.com/office/drawing/2016/5/9/chartex" xmlns:cx4="http://schemas.microsoft.com/office/drawing/2016/5/10/chartex" xmlns:cx5="http://schemas.microsoft.com/office/drawing/2016/5/11/chartex" xmlns:cx6="http://schemas.microsoft.com/office/drawing/2016/5/12/chartex" xmlns:cx7="http://schemas.microsoft.com/office/drawing/2016/5/13/chartex" xmlns:cx8="http://schemas.microsoft.com/office/drawing/2016/5/14/chartex" xmlns:mc="http://schemas.openxmlformats.org/markup-compatibility/2006" xmlns:aink="http://schemas.microsoft.com/office/drawing/2016/ink" xmlns:am3d="http://schemas.microsoft.com/office/drawing/2017/model3d" xmlns:o="urn:schemas-microsoft-com:office:office" xmlns:oel="http://schemas.microsoft.com/office/2019/extlst" xmlns:r="http://schemas.openxmlformats.org/officeDocument/2006/relationships" xmlns:m="http://schemas.openxmlformats.org/officeDocument/2006/math" xmlns:v="urn:schemas-microsoft-com:vml" xmlns:wp14="http://schemas.microsoft.com/office/word/2010/wordprocessingDrawing" xmlns:wp="http://schemas.openxmlformats.org/drawingml/2006/wordprocessingDrawing" xmlns:w10="urn:schemas-microsoft-com:office:word" xmlns:w="http://schemas.openxmlformats.org/wordprocessingml/2006/main" xmlns:w14="http://schemas.microsoft.com/office/word/2010/wordml" xmlns:w15="http://schemas.microsoft.com/office/word/2012/wordml" xmlns:w16cei="http://schemas.microsoft.com/office/word/2026/wordml/cei" xmlns:w16cex="http://schemas.microsoft.com/office/word/2018/wordml/cex" xmlns:w16cid="http://schemas.microsoft.com/office/word/2016/wordml/cid" xmlns:w16="http://schemas.microsoft.com/office/word/2018/wordml" xmlns:w16du="http://schemas.microsoft.com/office/word/2023/wordml/word16du" xmlns:w16sdtdh="http://schemas.microsoft.com/office/word/2020/wordml/sdtdatahash" xmlns:w16sdtfl="http://schemas.microsoft.com/office/word/2024/wordml/sdtformatlock" xmlns:w16se="http://schemas.microsoft.com/office/word/2015/wordml/symex" xmlns:wpg="http://schemas.microsoft.com/office/word/2010/wordprocessingGroup" xmlns:wpi="http://schemas.microsoft.com/office/word/2010/wordprocessingInk" xmlns:wne="http://schemas.microsoft.com/office/word/2006/wordml" xmlns:wps="http://schemas.microsoft.com/office/word/2010/wordprocessingShape" mc:Ignorable="w14 w15 w16se w16cid w16 w16cex w16sdtdh w16sdtfl w16du wp14">
   <w:body>
     <w:p>
       <w:r>
@@ -149,7 +149,7 @@
     </w:p>
     <w:p/>
     <w:p>
-      <w:bookmarkStart w:name="_ip8j1iahbmh1" w:colFirst="0" w:colLast="0" w:id="0"/>
+      <w:bookmarkStart w:id="0" w:name="_ip8j1iahbmh1" w:colFirst="0" w:colLast="0"/>
       <w:bookmarkEnd w:id="0"/>
       <w:r>
         <w:rPr>
@@ -388,6 +388,7 @@
           <w:sz w:val="40"/>
           <w:szCs w:val="40"/>
         </w:rPr>
+        <w:lastRenderedPageBreak/>
         <w:t>INDICE</w:t>
       </w:r>
     </w:p>
@@ -439,11 +440,6 @@
                 <w:color w:val="000000"/>
               </w:rPr>
               <w:tab/>
-            </w:r>
-            <w:r>
-              <w:rPr>
-                <w:color w:val="000000"/>
-              </w:rPr>
               <w:t>2</w:t>
             </w:r>
           </w:hyperlink>
@@ -478,11 +474,6 @@
                 <w:color w:val="000000"/>
               </w:rPr>
               <w:tab/>
-            </w:r>
-            <w:r>
-              <w:rPr>
-                <w:color w:val="000000"/>
-              </w:rPr>
               <w:t>3</w:t>
             </w:r>
           </w:hyperlink>
@@ -516,11 +507,6 @@
                 <w:color w:val="000000"/>
               </w:rPr>
               <w:tab/>
-            </w:r>
-            <w:r>
-              <w:rPr>
-                <w:color w:val="000000"/>
-              </w:rPr>
               <w:t>4</w:t>
             </w:r>
           </w:hyperlink>
@@ -554,11 +540,6 @@
                 <w:color w:val="000000"/>
               </w:rPr>
               <w:tab/>
-            </w:r>
-            <w:r>
-              <w:rPr>
-                <w:color w:val="000000"/>
-              </w:rPr>
               <w:t>5</w:t>
             </w:r>
           </w:hyperlink>
@@ -578,15 +559,16 @@
     </w:p>
     <w:p>
       <w:pPr>
-        <w:pStyle w:val="Heading1"/>
+        <w:pStyle w:val="Ttulo1"/>
         <w:rPr>
           <w:sz w:val="32"/>
           <w:szCs w:val="32"/>
         </w:rPr>
       </w:pPr>
-      <w:bookmarkStart w:name="_f9iuctpsv7mg" w:colFirst="0" w:colLast="0" w:id="1"/>
+      <w:bookmarkStart w:id="1" w:name="_f9iuctpsv7mg" w:colFirst="0" w:colLast="0"/>
       <w:bookmarkEnd w:id="1"/>
       <w:r>
+        <w:lastRenderedPageBreak/>
         <w:t>¿Quiénes somos?</w:t>
       </w:r>
     </w:p>
@@ -618,13 +600,13 @@
     <w:p>
       <w:pPr>
         <w:rPr>
-          <w:rFonts w:ascii="Calibri" w:hAnsi="Calibri" w:eastAsia="Calibri" w:cs="Calibri"/>
+          <w:rFonts w:ascii="Calibri" w:eastAsia="Calibri" w:hAnsi="Calibri" w:cs="Calibri"/>
           <w:color w:val="000000"/>
         </w:rPr>
       </w:pPr>
       <w:r>
         <w:rPr>
-          <w:rFonts w:ascii="Calibri" w:hAnsi="Calibri" w:eastAsia="Calibri" w:cs="Calibri"/>
+          <w:rFonts w:ascii="Calibri" w:eastAsia="Calibri" w:hAnsi="Calibri" w:cs="Calibri"/>
           <w:color w:val="000000"/>
         </w:rPr>
         <w:t>Somos un grupo de siete estudiantes comprometidos con el trabajo colaborativo, la investigación y el desarrollo de soluciones, orientadas a las necesidades de los usuarios. Para este Trabajo Práctico Integrador abordaremos la temática de los retiros holísticos, analizando su funcionamiento, los procesos involucrados y las necesidades de información que presentan. Nuestro objetivo es relevar los requerimientos necesarios para diseñar un Sistema de Información que permita optimizar la gestión de actividades, participantes, reservas y servicios ofrecidos por este tipo de organizaciones.</w:t>
@@ -697,9 +679,9 @@
     <w:p/>
     <w:p>
       <w:pPr>
-        <w:pStyle w:val="Heading1"/>
-      </w:pPr>
-      <w:bookmarkStart w:name="_Toc1132945350" w:id="2"/>
+        <w:pStyle w:val="Ttulo1"/>
+      </w:pPr>
+      <w:bookmarkStart w:id="2" w:name="_Toc1132945350"/>
       <w:r>
         <w:t>Enunciado del caso (viaje del cliente)</w:t>
       </w:r>
@@ -707,70 +689,20 @@
     </w:p>
     <w:p>
       <w:r>
-        <w:rPr/>
         <w:t>Una usuaria desea participar en un retiro holístico junto a tres amigas. Actualmente la información de los distintos retiros se encuentra dispersa en páginas web, redes sociales y contactos personales, lo que dificulta la comparación y organización de las opciones disponibles.</w:t>
       </w:r>
     </w:p>
     <w:p>
-      <w:pPr>
-        <w:pStyle w:val="Normal"/>
-      </w:pPr>
-      <w:r>
-        <w:rPr>
-          <w:rFonts w:ascii="Arial" w:hAnsi="Arial" w:eastAsia="Arial" w:cs="Arial"/>
-          <w:b w:val="0"/>
-          <w:bCs w:val="0"/>
-          <w:i w:val="0"/>
-          <w:iCs w:val="0"/>
-          <w:strike w:val="0"/>
-          <w:dstrike w:val="0"/>
-          <w:noProof w:val="0"/>
-          <w:color w:val="000000" w:themeColor="text1" w:themeTint="FF" w:themeShade="FF"/>
+      <w:r>
+        <w:rPr>
+          <w:rFonts w:ascii="Arial" w:eastAsia="Arial" w:hAnsi="Arial" w:cs="Arial"/>
+          <w:color w:val="000000" w:themeColor="text1"/>
           <w:sz w:val="22"/>
           <w:szCs w:val="22"/>
-          <w:u w:val="none"/>
-          <w:lang w:val="es-AR"/>
-        </w:rPr>
-        <w:t xml:space="preserve">La usuaria necesita una aplicación que le permita registrar los retiros holísticos de interés para </w:t>
-      </w:r>
-      <w:r>
-        <w:rPr>
-          <w:rFonts w:ascii="Arial" w:hAnsi="Arial" w:eastAsia="Arial" w:cs="Arial"/>
-          <w:b w:val="0"/>
-          <w:bCs w:val="0"/>
-          <w:i w:val="0"/>
-          <w:iCs w:val="0"/>
-          <w:strike w:val="0"/>
-          <w:dstrike w:val="0"/>
-          <w:noProof w:val="0"/>
-          <w:color w:val="000000" w:themeColor="text1" w:themeTint="FF" w:themeShade="FF"/>
-          <w:sz w:val="22"/>
-          <w:szCs w:val="22"/>
-          <w:u w:val="none"/>
-          <w:lang w:val="es-AR"/>
-        </w:rPr>
-        <w:t>luego consultarlos</w:t>
-      </w:r>
-      <w:r>
-        <w:rPr>
-          <w:rFonts w:ascii="Arial" w:hAnsi="Arial" w:eastAsia="Arial" w:cs="Arial"/>
-          <w:b w:val="0"/>
-          <w:bCs w:val="0"/>
-          <w:i w:val="0"/>
-          <w:iCs w:val="0"/>
-          <w:strike w:val="0"/>
-          <w:dstrike w:val="0"/>
-          <w:noProof w:val="0"/>
-          <w:color w:val="000000" w:themeColor="text1" w:themeTint="FF" w:themeShade="FF"/>
-          <w:sz w:val="22"/>
-          <w:szCs w:val="22"/>
-          <w:u w:val="none"/>
-          <w:lang w:val="es-AR"/>
-        </w:rPr>
-        <w:t>,</w:t>
-      </w:r>
-      <w:r>
-        <w:rPr/>
+        </w:rPr>
+        <w:t>La usuaria necesita una aplicación que le permita registrar los retiros holísticos de interés para luego consultarlos,</w:t>
+      </w:r>
+      <w:r>
         <w:t xml:space="preserve"> visualizar información relevante como fechas, duración, actividades incluidas, costos, imágenes y datos de contacto. Además, desea comparar distintas alternativas para elegir la más conveniente según sus intereses y disponibilidad.</w:t>
       </w:r>
     </w:p>
@@ -781,6 +713,7 @@
     </w:p>
     <w:p>
       <w:r>
+        <w:lastRenderedPageBreak/>
         <w:t>Una vez identificadas las opciones de interés, la usuaria puede compararlas para analizar diferencias en costos, actividades y fechas. Posteriormente selecciona un retiro y registra su participación.</w:t>
       </w:r>
     </w:p>
@@ -801,7 +734,7 @@
     </w:p>
     <w:p>
       <w:pPr>
-        <w:pStyle w:val="Heading1"/>
+        <w:pStyle w:val="Ttulo1"/>
         <w:rPr>
           <w:color w:val="000000" w:themeColor="text1"/>
         </w:rPr>
@@ -878,7 +811,7 @@
     </w:p>
     <w:p>
       <w:pPr>
-        <w:pStyle w:val="ListParagraph"/>
+        <w:pStyle w:val="Prrafodelista"/>
         <w:numPr>
           <w:ilvl w:val="0"/>
           <w:numId w:val="1"/>
@@ -896,7 +829,7 @@
     </w:p>
     <w:p>
       <w:pPr>
-        <w:pStyle w:val="ListParagraph"/>
+        <w:pStyle w:val="Prrafodelista"/>
         <w:numPr>
           <w:ilvl w:val="0"/>
           <w:numId w:val="1"/>
@@ -914,7 +847,7 @@
     </w:p>
     <w:p>
       <w:pPr>
-        <w:pStyle w:val="ListParagraph"/>
+        <w:pStyle w:val="Prrafodelista"/>
         <w:numPr>
           <w:ilvl w:val="0"/>
           <w:numId w:val="1"/>
@@ -932,7 +865,7 @@
     </w:p>
     <w:p>
       <w:pPr>
-        <w:pStyle w:val="ListParagraph"/>
+        <w:pStyle w:val="Prrafodelista"/>
         <w:numPr>
           <w:ilvl w:val="0"/>
           <w:numId w:val="1"/>
@@ -950,7 +883,7 @@
     </w:p>
     <w:p>
       <w:pPr>
-        <w:pStyle w:val="ListParagraph"/>
+        <w:pStyle w:val="Prrafodelista"/>
         <w:numPr>
           <w:ilvl w:val="0"/>
           <w:numId w:val="1"/>
@@ -968,7 +901,7 @@
     </w:p>
     <w:p>
       <w:pPr>
-        <w:pStyle w:val="ListParagraph"/>
+        <w:pStyle w:val="Prrafodelista"/>
         <w:numPr>
           <w:ilvl w:val="0"/>
           <w:numId w:val="1"/>
@@ -986,7 +919,7 @@
     </w:p>
     <w:p>
       <w:pPr>
-        <w:pStyle w:val="ListParagraph"/>
+        <w:pStyle w:val="Prrafodelista"/>
         <w:numPr>
           <w:ilvl w:val="0"/>
           <w:numId w:val="1"/>
@@ -1010,63 +943,37 @@
       </w:pPr>
       <w:r>
         <w:rPr>
-          <w:b w:val="1"/>
-          <w:bCs w:val="1"/>
-          <w:color w:val="000000" w:themeColor="text1" w:themeTint="FF" w:themeShade="FF"/>
+          <w:b/>
+          <w:bCs/>
+          <w:color w:val="000000" w:themeColor="text1"/>
         </w:rPr>
         <w:t>RF04.</w:t>
       </w:r>
       <w:r>
         <w:rPr>
-          <w:color w:val="000000" w:themeColor="text1" w:themeTint="FF" w:themeShade="FF"/>
+          <w:color w:val="000000" w:themeColor="text1"/>
         </w:rPr>
         <w:t xml:space="preserve"> El sistema deberá mostrar imágenes asociadas a cada retiro.</w:t>
       </w:r>
     </w:p>
     <w:p>
-      <w:pPr>
-        <w:pStyle w:val="Normal"/>
-        <w:rPr>
-          <w:rFonts w:ascii="Aptos" w:hAnsi="Aptos" w:eastAsia="Aptos" w:cs="Aptos"/>
-          <w:noProof w:val="0"/>
-          <w:sz w:val="24"/>
-          <w:szCs w:val="24"/>
-          <w:lang w:val="es-AR"/>
-        </w:rPr>
-      </w:pPr>
-      <w:r>
-        <w:rPr>
-          <w:rFonts w:ascii="Arial" w:hAnsi="Arial" w:eastAsia="Arial" w:cs="Arial"/>
-          <w:b w:val="1"/>
-          <w:bCs w:val="1"/>
-          <w:i w:val="0"/>
-          <w:iCs w:val="0"/>
-          <w:strike w:val="0"/>
-          <w:dstrike w:val="0"/>
-          <w:noProof w:val="0"/>
-          <w:color w:val="000000" w:themeColor="text1" w:themeTint="FF" w:themeShade="FF"/>
+      <w:r>
+        <w:rPr>
+          <w:rFonts w:ascii="Arial" w:eastAsia="Arial" w:hAnsi="Arial" w:cs="Arial"/>
+          <w:b/>
+          <w:bCs/>
+          <w:color w:val="000000" w:themeColor="text1"/>
           <w:sz w:val="22"/>
           <w:szCs w:val="22"/>
-          <w:u w:val="none"/>
-          <w:lang w:val="es-AR"/>
         </w:rPr>
         <w:t>RF05.</w:t>
       </w:r>
       <w:r>
         <w:rPr>
-          <w:rFonts w:ascii="Arial" w:hAnsi="Arial" w:eastAsia="Arial" w:cs="Arial"/>
-          <w:b w:val="0"/>
-          <w:bCs w:val="0"/>
-          <w:i w:val="0"/>
-          <w:iCs w:val="0"/>
-          <w:strike w:val="0"/>
-          <w:dstrike w:val="0"/>
-          <w:noProof w:val="0"/>
-          <w:color w:val="000000" w:themeColor="text1" w:themeTint="FF" w:themeShade="FF"/>
+          <w:rFonts w:ascii="Arial" w:eastAsia="Arial" w:hAnsi="Arial" w:cs="Arial"/>
+          <w:color w:val="000000" w:themeColor="text1"/>
           <w:sz w:val="22"/>
           <w:szCs w:val="22"/>
-          <w:u w:val="none"/>
-          <w:lang w:val="es-AR"/>
         </w:rPr>
         <w:t xml:space="preserve"> El sistema deberá permitir filtrar retiros por fecha, duración, ubicación, actividades ofrecidas.</w:t>
       </w:r>
@@ -1074,81 +981,78 @@
     <w:p>
       <w:r>
         <w:rPr>
-          <w:b w:val="1"/>
-          <w:bCs w:val="1"/>
+          <w:b/>
+          <w:bCs/>
         </w:rPr>
         <w:t>RF0</w:t>
       </w:r>
       <w:r>
         <w:rPr>
-          <w:b w:val="1"/>
-          <w:bCs w:val="1"/>
+          <w:b/>
+          <w:bCs/>
         </w:rPr>
         <w:t>6</w:t>
       </w:r>
       <w:r>
         <w:rPr>
-          <w:b w:val="1"/>
-          <w:bCs w:val="1"/>
+          <w:b/>
+          <w:bCs/>
         </w:rPr>
         <w:t>.</w:t>
       </w:r>
       <w:r>
-        <w:rPr/>
         <w:t xml:space="preserve"> El sistema deberá permitir comparar dos o más retiros.</w:t>
       </w:r>
     </w:p>
     <w:p>
       <w:r>
         <w:rPr>
-          <w:b w:val="1"/>
-          <w:bCs w:val="1"/>
+          <w:b/>
+          <w:bCs/>
         </w:rPr>
         <w:t>RF</w:t>
       </w:r>
       <w:r>
         <w:rPr>
-          <w:b w:val="1"/>
-          <w:bCs w:val="1"/>
+          <w:b/>
+          <w:bCs/>
         </w:rPr>
         <w:t>07</w:t>
       </w:r>
       <w:r>
         <w:rPr>
-          <w:b w:val="1"/>
-          <w:bCs w:val="1"/>
+          <w:b/>
+          <w:bCs/>
         </w:rPr>
         <w:t>.</w:t>
       </w:r>
       <w:r>
-        <w:rPr/>
         <w:t xml:space="preserve"> El sistema deberá permitir seleccionar un retiro para participar.</w:t>
       </w:r>
     </w:p>
     <w:p>
       <w:r>
         <w:rPr>
-          <w:b w:val="1"/>
-          <w:bCs w:val="1"/>
+          <w:b/>
+          <w:bCs/>
         </w:rPr>
         <w:t>RF</w:t>
       </w:r>
       <w:r>
         <w:rPr>
-          <w:b w:val="1"/>
-          <w:bCs w:val="1"/>
+          <w:b/>
+          <w:bCs/>
         </w:rPr>
         <w:t>08</w:t>
       </w:r>
       <w:r>
         <w:rPr>
-          <w:b w:val="1"/>
-          <w:bCs w:val="1"/>
+          <w:b/>
+          <w:bCs/>
         </w:rPr>
         <w:t>.</w:t>
       </w:r>
       <w:r>
-        <w:rPr/>
         <w:t xml:space="preserve"> El sistema deberá permitir registrar acompañantes para un retiro.</w:t>
       </w:r>
     </w:p>
@@ -1160,163 +1064,176 @@
       </w:pPr>
       <w:r>
         <w:rPr>
-          <w:b w:val="1"/>
-          <w:bCs w:val="1"/>
+          <w:b/>
+          <w:bCs/>
         </w:rPr>
         <w:t>RF</w:t>
       </w:r>
       <w:r>
         <w:rPr>
-          <w:b w:val="1"/>
-          <w:bCs w:val="1"/>
+          <w:b/>
+          <w:bCs/>
         </w:rPr>
         <w:t>09</w:t>
       </w:r>
       <w:r>
         <w:rPr>
-          <w:b w:val="1"/>
-          <w:bCs w:val="1"/>
+          <w:b/>
+          <w:bCs/>
         </w:rPr>
         <w:t>.</w:t>
       </w:r>
       <w:r>
-        <w:rPr/>
         <w:t xml:space="preserve"> El sistema deberá limitar la cantidad de participantes registrados a cuatro personas</w:t>
       </w:r>
     </w:p>
     <w:p>
       <w:r>
         <w:rPr>
-          <w:b w:val="1"/>
-          <w:bCs w:val="1"/>
+          <w:b/>
+          <w:bCs/>
         </w:rPr>
         <w:t>RF</w:t>
       </w:r>
       <w:r>
         <w:rPr>
-          <w:b w:val="1"/>
-          <w:bCs w:val="1"/>
+          <w:b/>
+          <w:bCs/>
         </w:rPr>
         <w:t>10</w:t>
       </w:r>
       <w:r>
         <w:rPr>
-          <w:b w:val="1"/>
-          <w:bCs w:val="1"/>
+          <w:b/>
+          <w:bCs/>
         </w:rPr>
         <w:t>.</w:t>
       </w:r>
       <w:r>
-        <w:rPr/>
         <w:t xml:space="preserve"> El sistema deberá permitir registrar información de pagos asociados a un retiro.</w:t>
       </w:r>
     </w:p>
     <w:p>
       <w:r>
         <w:rPr>
-          <w:b w:val="1"/>
-          <w:bCs w:val="1"/>
-        </w:rPr>
+          <w:b/>
+          <w:bCs/>
+        </w:rPr>
+        <w:lastRenderedPageBreak/>
         <w:t>RF1</w:t>
       </w:r>
       <w:r>
         <w:rPr>
-          <w:b w:val="1"/>
-          <w:bCs w:val="1"/>
+          <w:b/>
+          <w:bCs/>
         </w:rPr>
         <w:t>1</w:t>
       </w:r>
       <w:r>
         <w:rPr>
-          <w:b w:val="1"/>
-          <w:bCs w:val="1"/>
+          <w:b/>
+          <w:bCs/>
         </w:rPr>
         <w:t>.</w:t>
       </w:r>
       <w:r>
-        <w:rPr/>
         <w:t xml:space="preserve"> El sistema deberá generar recordatorios de vencimiento de pagos.</w:t>
       </w:r>
     </w:p>
     <w:p>
       <w:r>
         <w:rPr>
-          <w:b w:val="1"/>
-          <w:bCs w:val="1"/>
+          <w:b/>
+          <w:bCs/>
         </w:rPr>
         <w:t>RF1</w:t>
       </w:r>
       <w:r>
         <w:rPr>
-          <w:b w:val="1"/>
-          <w:bCs w:val="1"/>
+          <w:b/>
+          <w:bCs/>
         </w:rPr>
         <w:t>2</w:t>
       </w:r>
       <w:r>
         <w:rPr>
-          <w:b w:val="1"/>
-          <w:bCs w:val="1"/>
+          <w:b/>
+          <w:bCs/>
         </w:rPr>
         <w:t>.</w:t>
       </w:r>
       <w:r>
-        <w:rPr/>
         <w:t xml:space="preserve"> El sistema deberá generar recordatorios con información relevante del retiro.</w:t>
       </w:r>
     </w:p>
     <w:p>
       <w:r>
         <w:rPr>
-          <w:b w:val="1"/>
-          <w:bCs w:val="1"/>
+          <w:b/>
+          <w:bCs/>
         </w:rPr>
         <w:t>RF1</w:t>
       </w:r>
       <w:r>
         <w:rPr>
-          <w:b w:val="1"/>
-          <w:bCs w:val="1"/>
+          <w:b/>
+          <w:bCs/>
         </w:rPr>
         <w:t>3</w:t>
       </w:r>
       <w:r>
         <w:rPr>
-          <w:b w:val="1"/>
-          <w:bCs w:val="1"/>
+          <w:b/>
+          <w:bCs/>
         </w:rPr>
         <w:t>.</w:t>
       </w:r>
       <w:r>
-        <w:rPr/>
         <w:t xml:space="preserve"> El sistema deberá permitir visualizar los retiros organizados por mes o por rango de fechas.</w:t>
       </w:r>
     </w:p>
     <w:p>
       <w:r>
         <w:rPr>
-          <w:b w:val="1"/>
-          <w:bCs w:val="1"/>
+          <w:b/>
+          <w:bCs/>
         </w:rPr>
         <w:t>RF1</w:t>
       </w:r>
       <w:r>
         <w:rPr>
-          <w:b w:val="1"/>
-          <w:bCs w:val="1"/>
+          <w:b/>
+          <w:bCs/>
         </w:rPr>
         <w:t>4</w:t>
       </w:r>
       <w:r>
         <w:rPr>
-          <w:b w:val="1"/>
-          <w:bCs w:val="1"/>
+          <w:b/>
+          <w:bCs/>
         </w:rPr>
         <w:t>.</w:t>
       </w:r>
       <w:r>
-        <w:rPr/>
-        <w:t xml:space="preserve"> El sistema deberá almacenar el historial de retiros seleccionados.</w:t>
+        <w:t xml:space="preserve"> El sistema deberá </w:t>
+      </w:r>
+      <w:r>
+        <w:t>permitir consultar</w:t>
+      </w:r>
+      <w:r>
+        <w:t xml:space="preserve"> el historial de retiros seleccionados.</w:t>
+      </w:r>
+    </w:p>
+    <w:p>
+      <w:r>
+        <w:rPr>
+          <w:b/>
+          <w:bCs/>
+        </w:rPr>
+        <w:t>RF15</w:t>
+      </w:r>
+      <w:r>
+        <w:t>. El sistema deberá registrar y actualizar el estado de retiro.</w:t>
       </w:r>
     </w:p>
     <w:p>
@@ -1326,58 +1243,47 @@
     </w:p>
     <w:p>
       <w:r>
-        <w:rPr/>
+        <w:lastRenderedPageBreak/>
         <w:t>Anexo:</w:t>
       </w:r>
     </w:p>
     <w:p>
       <w:r>
-        <w:rPr/>
         <w:t>Para la elaboración del enunciado: preguntas que realizamos a la docente en clase.</w:t>
       </w:r>
     </w:p>
     <w:p>
       <w:r>
-        <w:rPr/>
         <w:t>Para la elaboración del logotipo usamos la IA.</w:t>
       </w:r>
     </w:p>
     <w:p>
       <w:r>
-        <w:rPr/>
-        <w:t xml:space="preserve">Investigación en redes de retiros </w:t>
-      </w:r>
-      <w:r>
-        <w:rPr/>
-        <w:t>holísticos</w:t>
-      </w:r>
-      <w:r>
-        <w:rPr/>
-        <w:t xml:space="preserve">: </w:t>
-      </w:r>
-    </w:p>
-    <w:p>
-      <w:pPr>
-        <w:pStyle w:val="Normal"/>
-      </w:pPr>
-      <w:r>
+        <w:t xml:space="preserve">Investigación en redes de retiros holísticos: </w:t>
+      </w:r>
+    </w:p>
+    <w:p>
+      <w:r>
+        <w:rPr>
+          <w:noProof/>
+        </w:rPr>
         <w:drawing>
-          <wp:inline wp14:editId="797829D1" wp14:anchorId="02CCD6C6">
+          <wp:inline distT="0" distB="0" distL="0" distR="0" wp14:anchorId="02CCD6C6" wp14:editId="797829D1">
             <wp:extent cx="5400675" cy="2676525"/>
             <wp:effectExtent l="0" t="0" r="0" b="0"/>
             <wp:docPr id="382985817" name="drawing"/>
             <wp:cNvGraphicFramePr>
-              <a:graphicFrameLocks noChangeAspect="1"/>
+              <a:graphicFrameLocks xmlns:a="http://schemas.openxmlformats.org/drawingml/2006/main" noChangeAspect="1"/>
             </wp:cNvGraphicFramePr>
-            <a:graphic>
-              <a:graphicData xmlns:a="http://schemas.openxmlformats.org/drawingml/2006/main" uri="http://schemas.openxmlformats.org/drawingml/2006/picture">
+            <a:graphic xmlns:a="http://schemas.openxmlformats.org/drawingml/2006/main">
+              <a:graphicData uri="http://schemas.openxmlformats.org/drawingml/2006/picture">
                 <pic:pic xmlns:pic="http://schemas.openxmlformats.org/drawingml/2006/picture">
                   <pic:nvPicPr>
                     <pic:cNvPr id="382985817" name="Picture 382985817"/>
                     <pic:cNvPicPr/>
                   </pic:nvPicPr>
                   <pic:blipFill>
-                    <a:blip xmlns:r="http://schemas.openxmlformats.org/officeDocument/2006/relationships" r:embed="rId13452911">
+                    <a:blip r:embed="rId14">
                       <a:extLst>
                         <a:ext uri="{28A0092B-C50C-407E-A947-70E740481C1C}">
                           <a14:useLocalDpi xmlns:a14="http://schemas.microsoft.com/office/drawing/2010/main"/>
@@ -1403,46 +1309,31 @@
           </wp:inline>
         </w:drawing>
       </w:r>
-      <w:hyperlink r:id="Ra0b1b674b8e44cd6">
+      <w:hyperlink r:id="rId15">
         <w:r>
           <w:rPr>
-            <w:rStyle w:val="Hyperlink"/>
+            <w:rStyle w:val="Hipervnculo"/>
           </w:rPr>
           <w:t>https://www.hosteriaelcambio.com.ar/</w:t>
         </w:r>
       </w:hyperlink>
     </w:p>
     <w:p>
-      <w:pPr>
-        <w:pStyle w:val="Normal"/>
-      </w:pPr>
-      <w:hyperlink r:id="R503b3087a8cf407b">
+      <w:hyperlink r:id="rId16">
         <w:r>
           <w:rPr>
-            <w:rStyle w:val="Hyperlink"/>
+            <w:rStyle w:val="Hipervnculo"/>
           </w:rPr>
           <w:t>https://www.laabundancia.com.ar/retiros</w:t>
         </w:r>
       </w:hyperlink>
     </w:p>
-    <w:p>
-      <w:pPr>
-        <w:pStyle w:val="Normal"/>
-      </w:pPr>
-    </w:p>
-    <w:p>
-      <w:pPr>
-        <w:pStyle w:val="Normal"/>
-      </w:pPr>
-    </w:p>
-    <w:p>
-      <w:pPr>
-        <w:pStyle w:val="Normal"/>
-      </w:pPr>
-    </w:p>
+    <w:p/>
+    <w:p/>
+    <w:p/>
     <w:p/>
     <w:sectPr>
-      <w:pgSz w:w="11906" w:h="16838" w:orient="portrait"/>
+      <w:pgSz w:w="11906" w:h="16838"/>
       <w:pgMar w:top="1417" w:right="1701" w:bottom="1417" w:left="1701" w:header="708" w:footer="708" w:gutter="0"/>
       <w:pgNumType w:start="1"/>
       <w:cols w:space="720"/>
@@ -1452,7 +1343,7 @@
 </file>
 
 <file path=word/numbering.xml><?xml version="1.0" encoding="utf-8"?>
-<w:numbering xmlns:wpc="http://schemas.microsoft.com/office/word/2010/wordprocessingCanvas" xmlns:cx="http://schemas.microsoft.com/office/drawing/2014/chartex" xmlns:cx1="http://schemas.microsoft.com/office/drawing/2015/9/8/chartex" xmlns:cx2="http://schemas.microsoft.com/office/drawing/2015/10/21/chartex" xmlns:cx3="http://schemas.microsoft.com/office/drawing/2016/5/9/chartex" xmlns:cx4="http://schemas.microsoft.com/office/drawing/2016/5/10/chartex" xmlns:cx5="http://schemas.microsoft.com/office/drawing/2016/5/11/chartex" xmlns:cx6="http://schemas.microsoft.com/office/drawing/2016/5/12/chartex" xmlns:cx7="http://schemas.microsoft.com/office/drawing/2016/5/13/chartex" xmlns:cx8="http://schemas.microsoft.com/office/drawing/2016/5/14/chartex" xmlns:mc="http://schemas.openxmlformats.org/markup-compatibility/2006" xmlns:aink="http://schemas.microsoft.com/office/drawing/2016/ink" xmlns:am3d="http://schemas.microsoft.com/office/drawing/2017/model3d" xmlns:o="urn:schemas-microsoft-com:office:office" xmlns:oel="http://schemas.microsoft.com/office/2019/extlst" xmlns:r="http://schemas.openxmlformats.org/officeDocument/2006/relationships" xmlns:m="http://schemas.openxmlformats.org/officeDocument/2006/math" xmlns:v="urn:schemas-microsoft-com:vml" xmlns:wp14="http://schemas.microsoft.com/office/word/2010/wordprocessingDrawing" xmlns:wp="http://schemas.openxmlformats.org/drawingml/2006/wordprocessingDrawing" xmlns:w10="urn:schemas-microsoft-com:office:word" xmlns:w="http://schemas.openxmlformats.org/wordprocessingml/2006/main" xmlns:w14="http://schemas.microsoft.com/office/word/2010/wordml" xmlns:w15="http://schemas.microsoft.com/office/word/2012/wordml" xmlns:w16cex="http://schemas.microsoft.com/office/word/2018/wordml/cex" xmlns:w16cid="http://schemas.microsoft.com/office/word/2016/wordml/cid" xmlns:w16="http://schemas.microsoft.com/office/word/2018/wordml" xmlns:w16du="http://schemas.microsoft.com/office/word/2023/wordml/word16du" xmlns:w16sdtdh="http://schemas.microsoft.com/office/word/2020/wordml/sdtdatahash" xmlns:w16sdtfl="http://schemas.microsoft.com/office/word/2024/wordml/sdtformatlock" xmlns:w16se="http://schemas.microsoft.com/office/word/2015/wordml/symex" xmlns:wpg="http://schemas.microsoft.com/office/word/2010/wordprocessingGroup" xmlns:wpi="http://schemas.microsoft.com/office/word/2010/wordprocessingInk" xmlns:wne="http://schemas.microsoft.com/office/word/2006/wordml" xmlns:wps="http://schemas.microsoft.com/office/word/2010/wordprocessingShape" mc:Ignorable="w14 w15 w16se w16cid w16 w16cex w16sdtdh w16sdtfl w16du wp14">
+<w:numbering xmlns:wpc="http://schemas.microsoft.com/office/word/2010/wordprocessingCanvas" xmlns:cx="http://schemas.microsoft.com/office/drawing/2014/chartex" xmlns:cx1="http://schemas.microsoft.com/office/drawing/2015/9/8/chartex" xmlns:cx2="http://schemas.microsoft.com/office/drawing/2015/10/21/chartex" xmlns:cx3="http://schemas.microsoft.com/office/drawing/2016/5/9/chartex" xmlns:cx4="http://schemas.microsoft.com/office/drawing/2016/5/10/chartex" xmlns:cx5="http://schemas.microsoft.com/office/drawing/2016/5/11/chartex" xmlns:cx6="http://schemas.microsoft.com/office/drawing/2016/5/12/chartex" xmlns:cx7="http://schemas.microsoft.com/office/drawing/2016/5/13/chartex" xmlns:cx8="http://schemas.microsoft.com/office/drawing/2016/5/14/chartex" xmlns:mc="http://schemas.openxmlformats.org/markup-compatibility/2006" xmlns:aink="http://schemas.microsoft.com/office/drawing/2016/ink" xmlns:am3d="http://schemas.microsoft.com/office/drawing/2017/model3d" xmlns:o="urn:schemas-microsoft-com:office:office" xmlns:oel="http://schemas.microsoft.com/office/2019/extlst" xmlns:r="http://schemas.openxmlformats.org/officeDocument/2006/relationships" xmlns:m="http://schemas.openxmlformats.org/officeDocument/2006/math" xmlns:v="urn:schemas-microsoft-com:vml" xmlns:wp14="http://schemas.microsoft.com/office/word/2010/wordprocessingDrawing" xmlns:wp="http://schemas.openxmlformats.org/drawingml/2006/wordprocessingDrawing" xmlns:w10="urn:schemas-microsoft-com:office:word" xmlns:w="http://schemas.openxmlformats.org/wordprocessingml/2006/main" xmlns:w14="http://schemas.microsoft.com/office/word/2010/wordml" xmlns:w15="http://schemas.microsoft.com/office/word/2012/wordml" xmlns:w16cei="http://schemas.microsoft.com/office/word/2026/wordml/cei" xmlns:w16cex="http://schemas.microsoft.com/office/word/2018/wordml/cex" xmlns:w16cid="http://schemas.microsoft.com/office/word/2016/wordml/cid" xmlns:w16="http://schemas.microsoft.com/office/word/2018/wordml" xmlns:w16du="http://schemas.microsoft.com/office/word/2023/wordml/word16du" xmlns:w16sdtdh="http://schemas.microsoft.com/office/word/2020/wordml/sdtdatahash" xmlns:w16sdtfl="http://schemas.microsoft.com/office/word/2024/wordml/sdtformatlock" xmlns:w16se="http://schemas.microsoft.com/office/word/2015/wordml/symex" xmlns:wpg="http://schemas.microsoft.com/office/word/2010/wordprocessingGroup" xmlns:wpi="http://schemas.microsoft.com/office/word/2010/wordprocessingInk" xmlns:wne="http://schemas.microsoft.com/office/word/2006/wordml" xmlns:wps="http://schemas.microsoft.com/office/word/2010/wordprocessingShape" mc:Ignorable="w14 w15 w16se w16cid w16 w16cex w16sdtdh w16sdtfl w16du wp14">
   <w:abstractNum w:abstractNumId="0" w15:restartNumberingAfterBreak="0">
     <w:nsid w:val="27988DFD"/>
     <w:multiLevelType w:val="multilevel"/>
@@ -1466,7 +1357,7 @@
         <w:ind w:left="720" w:hanging="360"/>
       </w:pPr>
       <w:rPr>
-        <w:rFonts w:hint="default" w:ascii="Symbol" w:hAnsi="Symbol"/>
+        <w:rFonts w:ascii="Symbol" w:hAnsi="Symbol" w:hint="default"/>
       </w:rPr>
     </w:lvl>
     <w:lvl w:ilvl="1">
@@ -1478,7 +1369,7 @@
         <w:ind w:left="1440" w:hanging="360"/>
       </w:pPr>
       <w:rPr>
-        <w:rFonts w:hint="default" w:ascii="Courier New" w:hAnsi="Courier New"/>
+        <w:rFonts w:ascii="Courier New" w:hAnsi="Courier New" w:hint="default"/>
       </w:rPr>
     </w:lvl>
     <w:lvl w:ilvl="2">
@@ -1490,7 +1381,7 @@
         <w:ind w:left="2160" w:hanging="360"/>
       </w:pPr>
       <w:rPr>
-        <w:rFonts w:hint="default" w:ascii="Wingdings" w:hAnsi="Wingdings"/>
+        <w:rFonts w:ascii="Wingdings" w:hAnsi="Wingdings" w:hint="default"/>
       </w:rPr>
     </w:lvl>
     <w:lvl w:ilvl="3">
@@ -1502,7 +1393,7 @@
         <w:ind w:left="2880" w:hanging="360"/>
       </w:pPr>
       <w:rPr>
-        <w:rFonts w:hint="default" w:ascii="Symbol" w:hAnsi="Symbol"/>
+        <w:rFonts w:ascii="Symbol" w:hAnsi="Symbol" w:hint="default"/>
       </w:rPr>
     </w:lvl>
     <w:lvl w:ilvl="4">
@@ -1514,7 +1405,7 @@
         <w:ind w:left="3600" w:hanging="360"/>
       </w:pPr>
       <w:rPr>
-        <w:rFonts w:hint="default" w:ascii="Courier New" w:hAnsi="Courier New"/>
+        <w:rFonts w:ascii="Courier New" w:hAnsi="Courier New" w:hint="default"/>
       </w:rPr>
     </w:lvl>
     <w:lvl w:ilvl="5">
@@ -1526,7 +1417,7 @@
         <w:ind w:left="4320" w:hanging="360"/>
       </w:pPr>
       <w:rPr>
-        <w:rFonts w:hint="default" w:ascii="Wingdings" w:hAnsi="Wingdings"/>
+        <w:rFonts w:ascii="Wingdings" w:hAnsi="Wingdings" w:hint="default"/>
       </w:rPr>
     </w:lvl>
     <w:lvl w:ilvl="6">
@@ -1538,7 +1429,7 @@
         <w:ind w:left="5040" w:hanging="360"/>
       </w:pPr>
       <w:rPr>
-        <w:rFonts w:hint="default" w:ascii="Symbol" w:hAnsi="Symbol"/>
+        <w:rFonts w:ascii="Symbol" w:hAnsi="Symbol" w:hint="default"/>
       </w:rPr>
     </w:lvl>
     <w:lvl w:ilvl="7">
@@ -1550,7 +1441,7 @@
         <w:ind w:left="5760" w:hanging="360"/>
       </w:pPr>
       <w:rPr>
-        <w:rFonts w:hint="default" w:ascii="Courier New" w:hAnsi="Courier New"/>
+        <w:rFonts w:ascii="Courier New" w:hAnsi="Courier New" w:hint="default"/>
       </w:rPr>
     </w:lvl>
     <w:lvl w:ilvl="8">
@@ -1562,7 +1453,7 @@
         <w:ind w:left="6480" w:hanging="360"/>
       </w:pPr>
       <w:rPr>
-        <w:rFonts w:hint="default" w:ascii="Wingdings" w:hAnsi="Wingdings"/>
+        <w:rFonts w:ascii="Wingdings" w:hAnsi="Wingdings" w:hint="default"/>
       </w:rPr>
     </w:lvl>
   </w:abstractNum>
@@ -1573,11 +1464,11 @@
 </file>
 
 <file path=word/styles.xml><?xml version="1.0" encoding="utf-8"?>
-<w:styles xmlns:wp14="http://schemas.microsoft.com/office/word/2010/wordprocessingDrawing" xmlns:mc="http://schemas.openxmlformats.org/markup-compatibility/2006" xmlns:r="http://schemas.openxmlformats.org/officeDocument/2006/relationships" xmlns:w="http://schemas.openxmlformats.org/wordprocessingml/2006/main" xmlns:w14="http://schemas.microsoft.com/office/word/2010/wordml" xmlns:w15="http://schemas.microsoft.com/office/word/2012/wordml" xmlns:w16cex="http://schemas.microsoft.com/office/word/2018/wordml/cex" xmlns:w16cid="http://schemas.microsoft.com/office/word/2016/wordml/cid" xmlns:w16="http://schemas.microsoft.com/office/word/2018/wordml" xmlns:w16du="http://schemas.microsoft.com/office/word/2023/wordml/word16du" xmlns:w16sdtdh="http://schemas.microsoft.com/office/word/2020/wordml/sdtdatahash" xmlns:w16sdtfl="http://schemas.microsoft.com/office/word/2024/wordml/sdtformatlock" xmlns:w16se="http://schemas.microsoft.com/office/word/2015/wordml/symex" mc:Ignorable="w14 w15 w16se w16cid w16 w16cex w16sdtdh w16sdtfl w16du wp14">
+<w:styles xmlns:mc="http://schemas.openxmlformats.org/markup-compatibility/2006" xmlns:r="http://schemas.openxmlformats.org/officeDocument/2006/relationships" xmlns:w="http://schemas.openxmlformats.org/wordprocessingml/2006/main" xmlns:w14="http://schemas.microsoft.com/office/word/2010/wordml" xmlns:w15="http://schemas.microsoft.com/office/word/2012/wordml" xmlns:w16cex="http://schemas.microsoft.com/office/word/2018/wordml/cex" xmlns:w16cid="http://schemas.microsoft.com/office/word/2016/wordml/cid" xmlns:w16="http://schemas.microsoft.com/office/word/2018/wordml" xmlns:w16du="http://schemas.microsoft.com/office/word/2023/wordml/word16du" xmlns:w16sdtdh="http://schemas.microsoft.com/office/word/2020/wordml/sdtdatahash" xmlns:w16sdtfl="http://schemas.microsoft.com/office/word/2024/wordml/sdtformatlock" xmlns:w16se="http://schemas.microsoft.com/office/word/2015/wordml/symex" mc:Ignorable="w14 w15 w16se w16cid w16 w16cex w16sdtdh w16sdtfl w16du">
   <w:docDefaults>
     <w:rPrDefault>
       <w:rPr>
-        <w:rFonts w:ascii="Aptos" w:hAnsi="Aptos" w:eastAsia="Aptos" w:cs="Aptos"/>
+        <w:rFonts w:ascii="Aptos" w:eastAsia="Aptos" w:hAnsi="Aptos" w:cs="Aptos"/>
         <w:sz w:val="24"/>
         <w:szCs w:val="24"/>
         <w:lang w:val="es-AR" w:eastAsia="es-AR" w:bidi="ar-SA"/>
@@ -1592,14 +1483,14 @@
   <w:latentStyles w:defLockedState="0" w:defUIPriority="99" w:defSemiHidden="0" w:defUnhideWhenUsed="0" w:defQFormat="0" w:count="376">
     <w:lsdException w:name="Normal" w:uiPriority="0" w:qFormat="1"/>
     <w:lsdException w:name="heading 1" w:uiPriority="9" w:qFormat="1"/>
-    <w:lsdException w:name="heading 2" w:uiPriority="9" w:semiHidden="1" w:unhideWhenUsed="1" w:qFormat="1"/>
-    <w:lsdException w:name="heading 3" w:uiPriority="9" w:semiHidden="1" w:unhideWhenUsed="1" w:qFormat="1"/>
-    <w:lsdException w:name="heading 4" w:uiPriority="9" w:semiHidden="1" w:unhideWhenUsed="1" w:qFormat="1"/>
-    <w:lsdException w:name="heading 5" w:uiPriority="9" w:semiHidden="1" w:unhideWhenUsed="1" w:qFormat="1"/>
-    <w:lsdException w:name="heading 6" w:uiPriority="9" w:semiHidden="1" w:unhideWhenUsed="1" w:qFormat="1"/>
-    <w:lsdException w:name="heading 7" w:uiPriority="9" w:semiHidden="1" w:unhideWhenUsed="1" w:qFormat="1"/>
-    <w:lsdException w:name="heading 8" w:uiPriority="9" w:semiHidden="1" w:unhideWhenUsed="1" w:qFormat="1"/>
-    <w:lsdException w:name="heading 9" w:uiPriority="9" w:semiHidden="1" w:unhideWhenUsed="1" w:qFormat="1"/>
+    <w:lsdException w:name="heading 2" w:semiHidden="1" w:uiPriority="9" w:unhideWhenUsed="1" w:qFormat="1"/>
+    <w:lsdException w:name="heading 3" w:semiHidden="1" w:uiPriority="9" w:unhideWhenUsed="1" w:qFormat="1"/>
+    <w:lsdException w:name="heading 4" w:semiHidden="1" w:uiPriority="9" w:unhideWhenUsed="1" w:qFormat="1"/>
+    <w:lsdException w:name="heading 5" w:semiHidden="1" w:uiPriority="9" w:unhideWhenUsed="1" w:qFormat="1"/>
+    <w:lsdException w:name="heading 6" w:semiHidden="1" w:uiPriority="9" w:unhideWhenUsed="1" w:qFormat="1"/>
+    <w:lsdException w:name="heading 7" w:semiHidden="1" w:uiPriority="9" w:unhideWhenUsed="1" w:qFormat="1"/>
+    <w:lsdException w:name="heading 8" w:semiHidden="1" w:uiPriority="9" w:unhideWhenUsed="1" w:qFormat="1"/>
+    <w:lsdException w:name="heading 9" w:semiHidden="1" w:uiPriority="9" w:unhideWhenUsed="1" w:qFormat="1"/>
     <w:lsdException w:name="index 1" w:semiHidden="1" w:unhideWhenUsed="1"/>
     <w:lsdException w:name="index 2" w:semiHidden="1" w:unhideWhenUsed="1"/>
     <w:lsdException w:name="index 3" w:semiHidden="1" w:unhideWhenUsed="1"/>
@@ -1609,22 +1500,22 @@
     <w:lsdException w:name="index 7" w:semiHidden="1" w:unhideWhenUsed="1"/>
     <w:lsdException w:name="index 8" w:semiHidden="1" w:unhideWhenUsed="1"/>
     <w:lsdException w:name="index 9" w:semiHidden="1" w:unhideWhenUsed="1"/>
-    <w:lsdException w:name="toc 1" w:uiPriority="39" w:semiHidden="1" w:unhideWhenUsed="1"/>
-    <w:lsdException w:name="toc 2" w:uiPriority="39" w:semiHidden="1" w:unhideWhenUsed="1"/>
-    <w:lsdException w:name="toc 3" w:uiPriority="39" w:semiHidden="1" w:unhideWhenUsed="1"/>
-    <w:lsdException w:name="toc 4" w:uiPriority="39" w:semiHidden="1" w:unhideWhenUsed="1"/>
-    <w:lsdException w:name="toc 5" w:uiPriority="39" w:semiHidden="1" w:unhideWhenUsed="1"/>
-    <w:lsdException w:name="toc 6" w:uiPriority="39" w:semiHidden="1" w:unhideWhenUsed="1"/>
-    <w:lsdException w:name="toc 7" w:uiPriority="39" w:semiHidden="1" w:unhideWhenUsed="1"/>
-    <w:lsdException w:name="toc 8" w:uiPriority="39" w:semiHidden="1" w:unhideWhenUsed="1"/>
-    <w:lsdException w:name="toc 9" w:uiPriority="39" w:semiHidden="1" w:unhideWhenUsed="1"/>
+    <w:lsdException w:name="toc 1" w:semiHidden="1" w:uiPriority="39" w:unhideWhenUsed="1"/>
+    <w:lsdException w:name="toc 2" w:semiHidden="1" w:uiPriority="39" w:unhideWhenUsed="1"/>
+    <w:lsdException w:name="toc 3" w:semiHidden="1" w:uiPriority="39" w:unhideWhenUsed="1"/>
+    <w:lsdException w:name="toc 4" w:semiHidden="1" w:uiPriority="39" w:unhideWhenUsed="1"/>
+    <w:lsdException w:name="toc 5" w:semiHidden="1" w:uiPriority="39" w:unhideWhenUsed="1"/>
+    <w:lsdException w:name="toc 6" w:semiHidden="1" w:uiPriority="39" w:unhideWhenUsed="1"/>
+    <w:lsdException w:name="toc 7" w:semiHidden="1" w:uiPriority="39" w:unhideWhenUsed="1"/>
+    <w:lsdException w:name="toc 8" w:semiHidden="1" w:uiPriority="39" w:unhideWhenUsed="1"/>
+    <w:lsdException w:name="toc 9" w:semiHidden="1" w:uiPriority="39" w:unhideWhenUsed="1"/>
     <w:lsdException w:name="Normal Indent" w:semiHidden="1" w:unhideWhenUsed="1"/>
     <w:lsdException w:name="footnote text" w:semiHidden="1" w:unhideWhenUsed="1"/>
     <w:lsdException w:name="annotation text" w:semiHidden="1" w:unhideWhenUsed="1"/>
     <w:lsdException w:name="header" w:semiHidden="1" w:unhideWhenUsed="1"/>
     <w:lsdException w:name="footer" w:semiHidden="1" w:unhideWhenUsed="1"/>
     <w:lsdException w:name="index heading" w:semiHidden="1" w:unhideWhenUsed="1"/>
-    <w:lsdException w:name="caption" w:uiPriority="35" w:semiHidden="1" w:unhideWhenUsed="1" w:qFormat="1"/>
+    <w:lsdException w:name="caption" w:semiHidden="1" w:uiPriority="35" w:unhideWhenUsed="1" w:qFormat="1"/>
     <w:lsdException w:name="table of figures" w:semiHidden="1" w:unhideWhenUsed="1"/>
     <w:lsdException w:name="envelope address" w:semiHidden="1" w:unhideWhenUsed="1"/>
     <w:lsdException w:name="envelope return" w:semiHidden="1" w:unhideWhenUsed="1"/>
@@ -1655,7 +1546,7 @@
     <w:lsdException w:name="Title" w:uiPriority="10" w:qFormat="1"/>
     <w:lsdException w:name="Closing" w:semiHidden="1" w:unhideWhenUsed="1"/>
     <w:lsdException w:name="Signature" w:semiHidden="1" w:unhideWhenUsed="1"/>
-    <w:lsdException w:name="Default Paragraph Font" w:uiPriority="1" w:semiHidden="1" w:unhideWhenUsed="1"/>
+    <w:lsdException w:name="Default Paragraph Font" w:semiHidden="1" w:uiPriority="1" w:unhideWhenUsed="1"/>
     <w:lsdException w:name="Body Text" w:semiHidden="1" w:unhideWhenUsed="1"/>
     <w:lsdException w:name="Body Text Indent" w:semiHidden="1" w:unhideWhenUsed="1"/>
     <w:lsdException w:name="List Continue" w:semiHidden="1" w:unhideWhenUsed="1"/>
@@ -1855,8 +1746,8 @@
     <w:lsdException w:name="Subtle Reference" w:uiPriority="31" w:qFormat="1"/>
     <w:lsdException w:name="Intense Reference" w:uiPriority="32" w:qFormat="1"/>
     <w:lsdException w:name="Book Title" w:uiPriority="33" w:qFormat="1"/>
-    <w:lsdException w:name="Bibliography" w:uiPriority="37" w:semiHidden="1" w:unhideWhenUsed="1"/>
-    <w:lsdException w:name="TOC Heading" w:uiPriority="39" w:semiHidden="1" w:unhideWhenUsed="1" w:qFormat="1"/>
+    <w:lsdException w:name="Bibliography" w:semiHidden="1" w:uiPriority="37" w:unhideWhenUsed="1"/>
+    <w:lsdException w:name="TOC Heading" w:semiHidden="1" w:uiPriority="39" w:unhideWhenUsed="1" w:qFormat="1"/>
     <w:lsdException w:name="Plain Table 1" w:uiPriority="41"/>
     <w:lsdException w:name="Plain Table 2" w:uiPriority="42"/>
     <w:lsdException w:name="Plain Table 3" w:uiPriority="43"/>
@@ -1967,11 +1858,11 @@
     <w:lsdException w:name="Unresolved Mention" w:semiHidden="1" w:unhideWhenUsed="1"/>
     <w:lsdException w:name="Smart Link" w:semiHidden="1" w:unhideWhenUsed="1"/>
   </w:latentStyles>
-  <w:style w:type="paragraph" w:styleId="Normal" w:default="1">
+  <w:style w:type="paragraph" w:default="1" w:styleId="Normal">
     <w:name w:val="Normal"/>
     <w:qFormat/>
   </w:style>
-  <w:style w:type="paragraph" w:styleId="Heading1">
+  <w:style w:type="paragraph" w:styleId="Ttulo1">
     <w:name w:val="heading 1"/>
     <w:basedOn w:val="Normal"/>
     <w:next w:val="Normal"/>
@@ -1985,7 +1876,7 @@
       <w:bCs/>
     </w:rPr>
   </w:style>
-  <w:style w:type="paragraph" w:styleId="Heading2">
+  <w:style w:type="paragraph" w:styleId="Ttulo2">
     <w:name w:val="heading 2"/>
     <w:basedOn w:val="Normal"/>
     <w:next w:val="Normal"/>
@@ -2000,13 +1891,13 @@
       <w:outlineLvl w:val="1"/>
     </w:pPr>
     <w:rPr>
-      <w:rFonts w:ascii="Play" w:hAnsi="Play" w:eastAsia="Play" w:cs="Play"/>
+      <w:rFonts w:ascii="Play" w:eastAsia="Play" w:hAnsi="Play" w:cs="Play"/>
       <w:color w:val="0F4761"/>
       <w:sz w:val="32"/>
       <w:szCs w:val="32"/>
     </w:rPr>
   </w:style>
-  <w:style w:type="paragraph" w:styleId="Heading3">
+  <w:style w:type="paragraph" w:styleId="Ttulo3">
     <w:name w:val="heading 3"/>
     <w:basedOn w:val="Normal"/>
     <w:next w:val="Normal"/>
@@ -2026,7 +1917,7 @@
       <w:szCs w:val="28"/>
     </w:rPr>
   </w:style>
-  <w:style w:type="paragraph" w:styleId="Heading4">
+  <w:style w:type="paragraph" w:styleId="Ttulo4">
     <w:name w:val="heading 4"/>
     <w:basedOn w:val="Normal"/>
     <w:next w:val="Normal"/>
@@ -2046,7 +1937,7 @@
       <w:color w:val="0F4761"/>
     </w:rPr>
   </w:style>
-  <w:style w:type="paragraph" w:styleId="Heading5">
+  <w:style w:type="paragraph" w:styleId="Ttulo5">
     <w:name w:val="heading 5"/>
     <w:basedOn w:val="Normal"/>
     <w:next w:val="Normal"/>
@@ -2064,7 +1955,7 @@
       <w:color w:val="0F4761"/>
     </w:rPr>
   </w:style>
-  <w:style w:type="paragraph" w:styleId="Heading6">
+  <w:style w:type="paragraph" w:styleId="Ttulo6">
     <w:name w:val="heading 6"/>
     <w:basedOn w:val="Normal"/>
     <w:next w:val="Normal"/>
@@ -2084,13 +1975,13 @@
       <w:color w:val="595959"/>
     </w:rPr>
   </w:style>
-  <w:style w:type="character" w:styleId="DefaultParagraphFont" w:default="1">
+  <w:style w:type="character" w:default="1" w:styleId="Fuentedeprrafopredeter">
     <w:name w:val="Default Paragraph Font"/>
     <w:uiPriority w:val="1"/>
     <w:semiHidden/>
     <w:unhideWhenUsed/>
   </w:style>
-  <w:style w:type="table" w:styleId="TableNormal" w:default="1">
+  <w:style w:type="table" w:default="1" w:styleId="Tablanormal">
     <w:name w:val="Normal Table"/>
     <w:uiPriority w:val="99"/>
     <w:semiHidden/>
@@ -2105,13 +1996,13 @@
       </w:tblCellMar>
     </w:tblPr>
   </w:style>
-  <w:style w:type="numbering" w:styleId="NoList" w:default="1">
+  <w:style w:type="numbering" w:default="1" w:styleId="Sinlista">
     <w:name w:val="No List"/>
     <w:uiPriority w:val="99"/>
     <w:semiHidden/>
     <w:unhideWhenUsed/>
   </w:style>
-  <w:style w:type="table" w:styleId="TableNormal0" w:customStyle="1">
+  <w:style w:type="table" w:customStyle="1" w:styleId="TableNormal">
     <w:name w:val="TableNormal"/>
     <w:tblPr>
       <w:tblCellMar>
@@ -2122,7 +2013,7 @@
       </w:tblCellMar>
     </w:tblPr>
   </w:style>
-  <w:style w:type="paragraph" w:styleId="Title">
+  <w:style w:type="paragraph" w:styleId="Ttulo">
     <w:name w:val="Title"/>
     <w:basedOn w:val="Normal"/>
     <w:next w:val="Normal"/>
@@ -2132,12 +2023,12 @@
       <w:spacing w:after="80" w:line="240" w:lineRule="auto"/>
     </w:pPr>
     <w:rPr>
-      <w:rFonts w:ascii="Play" w:hAnsi="Play" w:eastAsia="Play" w:cs="Play"/>
+      <w:rFonts w:ascii="Play" w:eastAsia="Play" w:hAnsi="Play" w:cs="Play"/>
       <w:sz w:val="56"/>
       <w:szCs w:val="56"/>
     </w:rPr>
   </w:style>
-  <w:style w:type="paragraph" w:styleId="Subtitle">
+  <w:style w:type="paragraph" w:styleId="Subttulo">
     <w:name w:val="Subtitle"/>
     <w:basedOn w:val="Normal"/>
     <w:next w:val="Normal"/>
@@ -2149,7 +2040,7 @@
       <w:szCs w:val="28"/>
     </w:rPr>
   </w:style>
-  <w:style w:type="paragraph" w:styleId="ListParagraph">
+  <w:style w:type="paragraph" w:styleId="Prrafodelista">
     <w:name w:val="List Paragraph"/>
     <w:basedOn w:val="Normal"/>
     <w:uiPriority w:val="34"/>
@@ -2160,10 +2051,10 @@
       <w:contextualSpacing/>
     </w:pPr>
   </w:style>
-  <w:style w:type="character" w:styleId="Hyperlink">
+  <w:style w:type="character" w:styleId="Hipervnculo">
+    <w:name w:val="Hyperlink"/>
+    <w:basedOn w:val="Fuentedeprrafopredeter"/>
     <w:uiPriority w:val="99"/>
-    <w:name w:val="Hyperlink"/>
-    <w:basedOn w:val="DefaultParagraphFont"/>
     <w:unhideWhenUsed/>
     <w:rsid w:val="422D3E43"/>
     <w:rPr>

</xml_diff>

<commit_message>
modifico rf 2, unifico rf 3 y 4 y elimino el 9 (cambio numeracion de requerimientos funcionales)
</commit_message>
<xml_diff>
--- a/Trabajo_ASI.docx
+++ b/Trabajo_ASI.docx
@@ -559,7 +559,7 @@
     </w:p>
     <w:p>
       <w:pPr>
-        <w:pStyle w:val="Heading1"/>
+        <w:pStyle w:val="Ttulo1"/>
         <w:rPr>
           <w:sz w:val="32"/>
           <w:szCs w:val="32"/>
@@ -679,7 +679,7 @@
     <w:p/>
     <w:p>
       <w:pPr>
-        <w:pStyle w:val="Heading1"/>
+        <w:pStyle w:val="Ttulo1"/>
       </w:pPr>
       <w:bookmarkStart w:id="2" w:name="_Toc1132945350"/>
       <w:r>
@@ -734,7 +734,7 @@
     </w:p>
     <w:p>
       <w:pPr>
-        <w:pStyle w:val="Heading1"/>
+        <w:pStyle w:val="Ttulo1"/>
         <w:rPr>
           <w:color w:val="000000" w:themeColor="text1"/>
         </w:rPr>
@@ -785,7 +785,19 @@
         <w:rPr>
           <w:color w:val="000000" w:themeColor="text1"/>
         </w:rPr>
-        <w:t xml:space="preserve"> El sistema deberá permitir registrar nuevos retiros.</w:t>
+        <w:t xml:space="preserve"> El sistema deberá permitir</w:t>
+      </w:r>
+      <w:r>
+        <w:rPr>
+          <w:color w:val="000000" w:themeColor="text1"/>
+        </w:rPr>
+        <w:t xml:space="preserve"> al usuario</w:t>
+      </w:r>
+      <w:r>
+        <w:rPr>
+          <w:color w:val="000000" w:themeColor="text1"/>
+        </w:rPr>
+        <w:t xml:space="preserve"> registrar nuevos retiros.</w:t>
       </w:r>
     </w:p>
     <w:p>
@@ -811,7 +823,7 @@
     </w:p>
     <w:p>
       <w:pPr>
-        <w:pStyle w:val="ListParagraph"/>
+        <w:pStyle w:val="Prrafodelista"/>
         <w:numPr>
           <w:ilvl w:val="0"/>
           <w:numId w:val="1"/>
@@ -829,7 +841,7 @@
     </w:p>
     <w:p>
       <w:pPr>
-        <w:pStyle w:val="ListParagraph"/>
+        <w:pStyle w:val="Prrafodelista"/>
         <w:numPr>
           <w:ilvl w:val="0"/>
           <w:numId w:val="1"/>
@@ -847,7 +859,7 @@
     </w:p>
     <w:p>
       <w:pPr>
-        <w:pStyle w:val="ListParagraph"/>
+        <w:pStyle w:val="Prrafodelista"/>
         <w:numPr>
           <w:ilvl w:val="0"/>
           <w:numId w:val="1"/>
@@ -865,7 +877,7 @@
     </w:p>
     <w:p>
       <w:pPr>
-        <w:pStyle w:val="ListParagraph"/>
+        <w:pStyle w:val="Prrafodelista"/>
         <w:numPr>
           <w:ilvl w:val="0"/>
           <w:numId w:val="1"/>
@@ -883,7 +895,7 @@
     </w:p>
     <w:p>
       <w:pPr>
-        <w:pStyle w:val="ListParagraph"/>
+        <w:pStyle w:val="Prrafodelista"/>
         <w:numPr>
           <w:ilvl w:val="0"/>
           <w:numId w:val="1"/>
@@ -901,7 +913,7 @@
     </w:p>
     <w:p>
       <w:pPr>
-        <w:pStyle w:val="ListParagraph"/>
+        <w:pStyle w:val="Prrafodelista"/>
         <w:numPr>
           <w:ilvl w:val="0"/>
           <w:numId w:val="1"/>
@@ -919,7 +931,7 @@
     </w:p>
     <w:p>
       <w:pPr>
-        <w:pStyle w:val="ListParagraph"/>
+        <w:pStyle w:val="Prrafodelista"/>
         <w:numPr>
           <w:ilvl w:val="0"/>
           <w:numId w:val="1"/>
@@ -937,23 +949,20 @@
     </w:p>
     <w:p>
       <w:pPr>
-        <w:rPr>
-          <w:color w:val="000000" w:themeColor="text1"/>
-        </w:rPr>
-      </w:pPr>
-      <w:r>
-        <w:rPr>
-          <w:b/>
-          <w:bCs/>
-          <w:color w:val="000000" w:themeColor="text1"/>
-        </w:rPr>
-        <w:t>RF04.</w:t>
-      </w:r>
-      <w:r>
-        <w:rPr>
-          <w:color w:val="000000" w:themeColor="text1"/>
-        </w:rPr>
-        <w:t xml:space="preserve"> El sistema deberá mostrar imágenes asociadas a cada retiro.</w:t>
+        <w:pStyle w:val="Prrafodelista"/>
+        <w:numPr>
+          <w:ilvl w:val="0"/>
+          <w:numId w:val="1"/>
+        </w:numPr>
+        <w:rPr>
+          <w:color w:val="000000" w:themeColor="text1"/>
+        </w:rPr>
+      </w:pPr>
+      <w:r>
+        <w:rPr>
+          <w:color w:val="000000" w:themeColor="text1"/>
+        </w:rPr>
+        <w:t>Imágenes</w:t>
       </w:r>
     </w:p>
     <w:p>
@@ -966,15 +975,37 @@
           <w:sz w:val="22"/>
           <w:szCs w:val="22"/>
         </w:rPr>
-        <w:t>RF05.</w:t>
+        <w:t>RF0</w:t>
       </w:r>
       <w:r>
         <w:rPr>
           <w:rFonts w:ascii="Arial" w:eastAsia="Arial" w:hAnsi="Arial" w:cs="Arial"/>
+          <w:b/>
+          <w:bCs/>
           <w:color w:val="000000" w:themeColor="text1"/>
           <w:sz w:val="22"/>
           <w:szCs w:val="22"/>
         </w:rPr>
+        <w:t>4</w:t>
+      </w:r>
+      <w:r>
+        <w:rPr>
+          <w:rFonts w:ascii="Arial" w:eastAsia="Arial" w:hAnsi="Arial" w:cs="Arial"/>
+          <w:b/>
+          <w:bCs/>
+          <w:color w:val="000000" w:themeColor="text1"/>
+          <w:sz w:val="22"/>
+          <w:szCs w:val="22"/>
+        </w:rPr>
+        <w:t>.</w:t>
+      </w:r>
+      <w:r>
+        <w:rPr>
+          <w:rFonts w:ascii="Arial" w:eastAsia="Arial" w:hAnsi="Arial" w:cs="Arial"/>
+          <w:color w:val="000000" w:themeColor="text1"/>
+          <w:sz w:val="22"/>
+          <w:szCs w:val="22"/>
+        </w:rPr>
         <w:t xml:space="preserve"> El sistema deberá permitir filtrar retiros por fecha, duración, ubicación, actividades ofrecidas.</w:t>
       </w:r>
     </w:p>
@@ -991,6 +1022,39 @@
           <w:b/>
           <w:bCs/>
         </w:rPr>
+        <w:t>5</w:t>
+      </w:r>
+      <w:r>
+        <w:rPr>
+          <w:b/>
+          <w:bCs/>
+        </w:rPr>
+        <w:t>.</w:t>
+      </w:r>
+      <w:r>
+        <w:t xml:space="preserve"> El sistema deberá permitir comparar dos o más retiros.</w:t>
+      </w:r>
+    </w:p>
+    <w:p>
+      <w:r>
+        <w:rPr>
+          <w:b/>
+          <w:bCs/>
+        </w:rPr>
+        <w:t>RF</w:t>
+      </w:r>
+      <w:r>
+        <w:rPr>
+          <w:b/>
+          <w:bCs/>
+        </w:rPr>
+        <w:t>0</w:t>
+      </w:r>
+      <w:r>
+        <w:rPr>
+          <w:b/>
+          <w:bCs/>
+        </w:rPr>
         <w:t>6</w:t>
       </w:r>
       <w:r>
@@ -1001,7 +1065,7 @@
         <w:t>.</w:t>
       </w:r>
       <w:r>
-        <w:t xml:space="preserve"> El sistema deberá permitir comparar dos o más retiros.</w:t>
+        <w:t xml:space="preserve"> El sistema deberá permitir seleccionar un retiro para participar.</w:t>
       </w:r>
     </w:p>
     <w:p>
@@ -1017,7 +1081,14 @@
           <w:b/>
           <w:bCs/>
         </w:rPr>
-        <w:t>07</w:t>
+        <w:t>0</w:t>
+      </w:r>
+      <w:r>
+        <w:rPr>
+          <w:b/>
+          <w:bCs/>
+        </w:rPr>
+        <w:t>7</w:t>
       </w:r>
       <w:r>
         <w:rPr>
@@ -1027,7 +1098,7 @@
         <w:t>.</w:t>
       </w:r>
       <w:r>
-        <w:t xml:space="preserve"> El sistema deberá permitir seleccionar un retiro para participar.</w:t>
+        <w:t xml:space="preserve"> El sistema deberá permitir registrar acompañantes para un retiro.</w:t>
       </w:r>
     </w:p>
     <w:p>
@@ -1053,15 +1124,10 @@
         <w:t>.</w:t>
       </w:r>
       <w:r>
-        <w:t xml:space="preserve"> El sistema deberá permitir registrar acompañantes para un retiro.</w:t>
-      </w:r>
-    </w:p>
-    <w:p>
-      <w:pPr>
-        <w:rPr>
-          <w:color w:val="000000" w:themeColor="text1"/>
-        </w:rPr>
-      </w:pPr>
+        <w:t xml:space="preserve"> El sistema deberá permitir registrar información de pagos asociados a un retiro.</w:t>
+      </w:r>
+    </w:p>
+    <w:p>
       <w:r>
         <w:rPr>
           <w:b/>
@@ -1084,33 +1150,10 @@
         <w:t>.</w:t>
       </w:r>
       <w:r>
-        <w:t xml:space="preserve"> El sistema deberá limitar la cantidad de participantes registrados a cuatro personas</w:t>
-      </w:r>
-    </w:p>
-    <w:p>
-      <w:r>
-        <w:rPr>
-          <w:b/>
-          <w:bCs/>
-        </w:rPr>
-        <w:t>RF</w:t>
-      </w:r>
-      <w:r>
-        <w:rPr>
-          <w:b/>
-          <w:bCs/>
-        </w:rPr>
-        <w:t>10</w:t>
-      </w:r>
-      <w:r>
-        <w:rPr>
-          <w:b/>
-          <w:bCs/>
-        </w:rPr>
-        <w:t>.</w:t>
-      </w:r>
-      <w:r>
-        <w:t xml:space="preserve"> El sistema deberá permitir registrar información de pagos asociados a un retiro.</w:t>
+        <w:t xml:space="preserve"> </w:t>
+      </w:r>
+      <w:r>
+        <w:t>El sistema deberá generar recordatorios de pago una semana antes del vencimiento.</w:t>
       </w:r>
     </w:p>
     <w:p>
@@ -1127,6 +1170,32 @@
           <w:b/>
           <w:bCs/>
         </w:rPr>
+        <w:t>0</w:t>
+      </w:r>
+      <w:r>
+        <w:rPr>
+          <w:b/>
+          <w:bCs/>
+        </w:rPr>
+        <w:t>.</w:t>
+      </w:r>
+      <w:r>
+        <w:t xml:space="preserve"> El sistema deberá generar recordatorios con información relevante del retiro.</w:t>
+      </w:r>
+    </w:p>
+    <w:p>
+      <w:r>
+        <w:rPr>
+          <w:b/>
+          <w:bCs/>
+        </w:rPr>
+        <w:t>RF1</w:t>
+      </w:r>
+      <w:r>
+        <w:rPr>
+          <w:b/>
+          <w:bCs/>
+        </w:rPr>
         <w:t>1</w:t>
       </w:r>
       <w:r>
@@ -1137,10 +1206,7 @@
         <w:t>.</w:t>
       </w:r>
       <w:r>
-        <w:t xml:space="preserve"> </w:t>
-      </w:r>
-      <w:r>
-        <w:t>El sistema deberá generar recordatorios de pago una semana antes del vencimiento.</w:t>
+        <w:t xml:space="preserve"> El sistema deberá permitir visualizar los retiros organizados por mes o por rango de fechas.</w:t>
       </w:r>
     </w:p>
     <w:p>
@@ -1166,7 +1232,13 @@
         <w:t>.</w:t>
       </w:r>
       <w:r>
-        <w:t xml:space="preserve"> El sistema deberá generar recordatorios con información relevante del retiro.</w:t>
+        <w:t xml:space="preserve"> El sistema deberá </w:t>
+      </w:r>
+      <w:r>
+        <w:t>permitir consultar</w:t>
+      </w:r>
+      <w:r>
+        <w:t xml:space="preserve"> el historial de retiros seleccionados.</w:t>
       </w:r>
     </w:p>
     <w:p>
@@ -1185,14 +1257,7 @@
         <w:t>3</w:t>
       </w:r>
       <w:r>
-        <w:rPr>
-          <w:b/>
-          <w:bCs/>
-        </w:rPr>
-        <w:t>.</w:t>
-      </w:r>
-      <w:r>
-        <w:t xml:space="preserve"> El sistema deberá permitir visualizar los retiros organizados por mes o por rango de fechas.</w:t>
+        <w:t>. El sistema deberá registrar y actualizar el estado de retiro.</w:t>
       </w:r>
     </w:p>
     <w:p>
@@ -1215,44 +1280,7 @@
           <w:b/>
           <w:bCs/>
         </w:rPr>
-        <w:t>.</w:t>
-      </w:r>
-      <w:r>
-        <w:t xml:space="preserve"> El sistema deberá </w:t>
-      </w:r>
-      <w:r>
-        <w:t>permitir consultar</w:t>
-      </w:r>
-      <w:r>
-        <w:t xml:space="preserve"> el historial de retiros seleccionados.</w:t>
-      </w:r>
-    </w:p>
-    <w:p>
-      <w:r>
-        <w:rPr>
-          <w:b/>
-          <w:bCs/>
-        </w:rPr>
-        <w:t>RF15</w:t>
-      </w:r>
-      <w:r>
-        <w:t>. El sistema deberá registrar y actualizar el estado de retiro.</w:t>
-      </w:r>
-    </w:p>
-    <w:p>
-      <w:r>
-        <w:rPr>
-          <w:b/>
-          <w:bCs/>
-        </w:rPr>
-        <w:t>RF1</w:t>
-      </w:r>
-      <w:r>
-        <w:rPr>
-          <w:b/>
-          <w:bCs/>
-        </w:rPr>
-        <w:t xml:space="preserve">6. </w:t>
+        <w:t xml:space="preserve">. </w:t>
       </w:r>
       <w:r>
         <w:t>El sistema deberá permitir registrar valoraciones posteriores al retiro.</w:t>
@@ -1332,7 +1360,7 @@
       <w:hyperlink r:id="rId15">
         <w:r>
           <w:rPr>
-            <w:rStyle w:val="Hyperlink"/>
+            <w:rStyle w:val="Hipervnculo"/>
           </w:rPr>
           <w:t>https://www.hosteriaelcambio.com.ar/</w:t>
         </w:r>
@@ -1342,7 +1370,7 @@
       <w:hyperlink r:id="rId16">
         <w:r>
           <w:rPr>
-            <w:rStyle w:val="Hyperlink"/>
+            <w:rStyle w:val="Hipervnculo"/>
           </w:rPr>
           <w:t>https://www.laabundancia.com.ar/retiros</w:t>
         </w:r>
@@ -1882,7 +1910,7 @@
     <w:name w:val="Normal"/>
     <w:qFormat/>
   </w:style>
-  <w:style w:type="paragraph" w:styleId="Heading1">
+  <w:style w:type="paragraph" w:styleId="Ttulo1">
     <w:name w:val="heading 1"/>
     <w:basedOn w:val="Normal"/>
     <w:next w:val="Normal"/>
@@ -1896,7 +1924,7 @@
       <w:bCs/>
     </w:rPr>
   </w:style>
-  <w:style w:type="paragraph" w:styleId="Heading2">
+  <w:style w:type="paragraph" w:styleId="Ttulo2">
     <w:name w:val="heading 2"/>
     <w:basedOn w:val="Normal"/>
     <w:next w:val="Normal"/>
@@ -1917,7 +1945,7 @@
       <w:szCs w:val="32"/>
     </w:rPr>
   </w:style>
-  <w:style w:type="paragraph" w:styleId="Heading3">
+  <w:style w:type="paragraph" w:styleId="Ttulo3">
     <w:name w:val="heading 3"/>
     <w:basedOn w:val="Normal"/>
     <w:next w:val="Normal"/>
@@ -1937,7 +1965,7 @@
       <w:szCs w:val="28"/>
     </w:rPr>
   </w:style>
-  <w:style w:type="paragraph" w:styleId="Heading4">
+  <w:style w:type="paragraph" w:styleId="Ttulo4">
     <w:name w:val="heading 4"/>
     <w:basedOn w:val="Normal"/>
     <w:next w:val="Normal"/>
@@ -1957,7 +1985,7 @@
       <w:color w:val="0F4761"/>
     </w:rPr>
   </w:style>
-  <w:style w:type="paragraph" w:styleId="Heading5">
+  <w:style w:type="paragraph" w:styleId="Ttulo5">
     <w:name w:val="heading 5"/>
     <w:basedOn w:val="Normal"/>
     <w:next w:val="Normal"/>
@@ -1975,7 +2003,7 @@
       <w:color w:val="0F4761"/>
     </w:rPr>
   </w:style>
-  <w:style w:type="paragraph" w:styleId="Heading6">
+  <w:style w:type="paragraph" w:styleId="Ttulo6">
     <w:name w:val="heading 6"/>
     <w:basedOn w:val="Normal"/>
     <w:next w:val="Normal"/>
@@ -1995,12 +2023,13 @@
       <w:color w:val="595959"/>
     </w:rPr>
   </w:style>
-  <w:style w:type="character" w:default="1" w:styleId="DefaultParagraphFont">
+  <w:style w:type="character" w:default="1" w:styleId="Fuentedeprrafopredeter">
     <w:name w:val="Default Paragraph Font"/>
     <w:uiPriority w:val="1"/>
+    <w:semiHidden/>
     <w:unhideWhenUsed/>
   </w:style>
-  <w:style w:type="table" w:default="1" w:styleId="TableNormal">
+  <w:style w:type="table" w:default="1" w:styleId="Tablanormal">
     <w:name w:val="Normal Table"/>
     <w:uiPriority w:val="99"/>
     <w:semiHidden/>
@@ -2015,13 +2044,13 @@
       </w:tblCellMar>
     </w:tblPr>
   </w:style>
-  <w:style w:type="numbering" w:default="1" w:styleId="NoList">
+  <w:style w:type="numbering" w:default="1" w:styleId="Sinlista">
     <w:name w:val="No List"/>
     <w:uiPriority w:val="99"/>
     <w:semiHidden/>
     <w:unhideWhenUsed/>
   </w:style>
-  <w:style w:type="table" w:customStyle="1" w:styleId="TableNormal0">
+  <w:style w:type="table" w:customStyle="1" w:styleId="TableNormal">
     <w:name w:val="TableNormal"/>
     <w:tblPr>
       <w:tblCellMar>
@@ -2032,7 +2061,7 @@
       </w:tblCellMar>
     </w:tblPr>
   </w:style>
-  <w:style w:type="paragraph" w:styleId="Title">
+  <w:style w:type="paragraph" w:styleId="Ttulo">
     <w:name w:val="Title"/>
     <w:basedOn w:val="Normal"/>
     <w:next w:val="Normal"/>
@@ -2047,7 +2076,7 @@
       <w:szCs w:val="56"/>
     </w:rPr>
   </w:style>
-  <w:style w:type="paragraph" w:styleId="Subtitle">
+  <w:style w:type="paragraph" w:styleId="Subttulo">
     <w:name w:val="Subtitle"/>
     <w:basedOn w:val="Normal"/>
     <w:next w:val="Normal"/>
@@ -2059,7 +2088,7 @@
       <w:szCs w:val="28"/>
     </w:rPr>
   </w:style>
-  <w:style w:type="paragraph" w:styleId="ListParagraph">
+  <w:style w:type="paragraph" w:styleId="Prrafodelista">
     <w:name w:val="List Paragraph"/>
     <w:basedOn w:val="Normal"/>
     <w:uiPriority w:val="34"/>
@@ -2070,9 +2099,9 @@
       <w:contextualSpacing/>
     </w:pPr>
   </w:style>
-  <w:style w:type="character" w:styleId="Hyperlink">
+  <w:style w:type="character" w:styleId="Hipervnculo">
     <w:name w:val="Hyperlink"/>
-    <w:basedOn w:val="DefaultParagraphFont"/>
+    <w:basedOn w:val="Fuentedeprrafopredeter"/>
     <w:uiPriority w:val="99"/>
     <w:unhideWhenUsed/>
     <w:rsid w:val="422D3E43"/>

</xml_diff>

<commit_message>
Agrego Diagrama de Clases
</commit_message>
<xml_diff>
--- a/Trabajo_ASI.docx
+++ b/Trabajo_ASI.docx
@@ -1285,6 +1285,104 @@
       <w:r>
         <w:t>El sistema deberá permitir registrar valoraciones posteriores al retiro.</w:t>
       </w:r>
+    </w:p>
+    <w:p/>
+    <w:p/>
+    <w:p/>
+    <w:p/>
+    <w:p/>
+    <w:p/>
+    <w:p/>
+    <w:p/>
+    <w:p/>
+    <w:p/>
+    <w:p/>
+    <w:p/>
+    <w:p/>
+    <w:p/>
+    <w:p/>
+    <w:p/>
+    <w:p/>
+    <w:p/>
+    <w:p/>
+    <w:p/>
+    <w:p/>
+    <w:p/>
+    <w:p>
+      <w:pPr>
+        <w:pStyle w:val="Ttulo1"/>
+      </w:pPr>
+      <w:r>
+        <w:lastRenderedPageBreak/>
+        <w:drawing>
+          <wp:anchor distT="0" distB="0" distL="114300" distR="114300" simplePos="0" relativeHeight="251658240" behindDoc="0" locked="0" layoutInCell="1" allowOverlap="1" wp14:anchorId="78B1791F" wp14:editId="577B6528">
+            <wp:simplePos x="0" y="0"/>
+            <wp:positionH relativeFrom="column">
+              <wp:posOffset>-782955</wp:posOffset>
+            </wp:positionH>
+            <wp:positionV relativeFrom="paragraph">
+              <wp:posOffset>318770</wp:posOffset>
+            </wp:positionV>
+            <wp:extent cx="6898640" cy="4780280"/>
+            <wp:effectExtent l="0" t="0" r="0" b="1270"/>
+            <wp:wrapTopAndBottom/>
+            <wp:docPr id="759985614" name="Imagen 2"/>
+            <wp:cNvGraphicFramePr>
+              <a:graphicFrameLocks xmlns:a="http://schemas.openxmlformats.org/drawingml/2006/main" noChangeAspect="1"/>
+            </wp:cNvGraphicFramePr>
+            <a:graphic xmlns:a="http://schemas.openxmlformats.org/drawingml/2006/main">
+              <a:graphicData uri="http://schemas.openxmlformats.org/drawingml/2006/picture">
+                <pic:pic xmlns:pic="http://schemas.openxmlformats.org/drawingml/2006/picture">
+                  <pic:nvPicPr>
+                    <pic:cNvPr id="0" name="Picture 6"/>
+                    <pic:cNvPicPr>
+                      <a:picLocks noChangeAspect="1" noChangeArrowheads="1"/>
+                    </pic:cNvPicPr>
+                  </pic:nvPicPr>
+                  <pic:blipFill>
+                    <a:blip r:embed="rId14">
+                      <a:extLst>
+                        <a:ext uri="{28A0092B-C50C-407E-A947-70E740481C1C}">
+                          <a14:useLocalDpi xmlns:a14="http://schemas.microsoft.com/office/drawing/2010/main" val="0"/>
+                        </a:ext>
+                      </a:extLst>
+                    </a:blip>
+                    <a:srcRect/>
+                    <a:stretch>
+                      <a:fillRect/>
+                    </a:stretch>
+                  </pic:blipFill>
+                  <pic:spPr bwMode="auto">
+                    <a:xfrm>
+                      <a:off x="0" y="0"/>
+                      <a:ext cx="6898640" cy="4780280"/>
+                    </a:xfrm>
+                    <a:prstGeom prst="rect">
+                      <a:avLst/>
+                    </a:prstGeom>
+                    <a:noFill/>
+                    <a:ln>
+                      <a:noFill/>
+                    </a:ln>
+                  </pic:spPr>
+                </pic:pic>
+              </a:graphicData>
+            </a:graphic>
+            <wp14:sizeRelH relativeFrom="margin">
+              <wp14:pctWidth>0</wp14:pctWidth>
+            </wp14:sizeRelH>
+            <wp14:sizeRelV relativeFrom="margin">
+              <wp14:pctHeight>0</wp14:pctHeight>
+            </wp14:sizeRelV>
+          </wp:anchor>
+        </w:drawing>
+      </w:r>
+      <w:r>
+        <w:t>Diagrama de Clases</w:t>
+      </w:r>
+    </w:p>
+    <w:p/>
+    <w:p>
       <w:r>
         <w:br w:type="page"/>
       </w:r>
@@ -1331,7 +1429,7 @@
                     <pic:cNvPicPr/>
                   </pic:nvPicPr>
                   <pic:blipFill>
-                    <a:blip r:embed="rId14">
+                    <a:blip r:embed="rId15">
                       <a:extLst>
                         <a:ext uri="{28A0092B-C50C-407E-A947-70E740481C1C}">
                           <a14:useLocalDpi xmlns:a14="http://schemas.microsoft.com/office/drawing/2010/main"/>
@@ -1357,7 +1455,7 @@
           </wp:inline>
         </w:drawing>
       </w:r>
-      <w:hyperlink r:id="rId15">
+      <w:hyperlink r:id="rId16">
         <w:r>
           <w:rPr>
             <w:rStyle w:val="Hipervnculo"/>
@@ -1367,7 +1465,7 @@
       </w:hyperlink>
     </w:p>
     <w:p>
-      <w:hyperlink r:id="rId16">
+      <w:hyperlink r:id="rId17">
         <w:r>
           <w:rPr>
             <w:rStyle w:val="Hipervnculo"/>
@@ -2026,7 +2124,6 @@
   <w:style w:type="character" w:default="1" w:styleId="Fuentedeprrafopredeter">
     <w:name w:val="Default Paragraph Font"/>
     <w:uiPriority w:val="1"/>
-    <w:semiHidden/>
     <w:unhideWhenUsed/>
   </w:style>
   <w:style w:type="table" w:default="1" w:styleId="Tablanormal">

</xml_diff>